<commit_message>
update Riemannian geodesics docx and figures
</commit_message>
<xml_diff>
--- a/docs/Riemannian_geodesics/Jacobi_metric_and_Geodesics_in_Riemannian_Geometry.docx
+++ b/docs/Riemannian_geodesics/Jacobi_metric_and_Geodesics_in_Riemannian_Geometry.docx
@@ -1,6 +1,6 @@
 
 <file path=word/document.xml><?xml version="1.0" encoding="utf-8"?>
-<w:document xmlns:wpc="http://schemas.microsoft.com/office/word/2010/wordprocessingCanvas" xmlns:cx="http://schemas.microsoft.com/office/drawing/2014/chartex" xmlns:cx1="http://schemas.microsoft.com/office/drawing/2015/9/8/chartex" xmlns:cx2="http://schemas.microsoft.com/office/drawing/2015/10/21/chartex" xmlns:cx3="http://schemas.microsoft.com/office/drawing/2016/5/9/chartex" xmlns:cx4="http://schemas.microsoft.com/office/drawing/2016/5/10/chartex" xmlns:cx5="http://schemas.microsoft.com/office/drawing/2016/5/11/chartex" xmlns:cx6="http://schemas.microsoft.com/office/drawing/2016/5/12/chartex" xmlns:cx7="http://schemas.microsoft.com/office/drawing/2016/5/13/chartex" xmlns:cx8="http://schemas.microsoft.com/office/drawing/2016/5/14/chartex" xmlns:mc="http://schemas.openxmlformats.org/markup-compatibility/2006" xmlns:aink="http://schemas.microsoft.com/office/drawing/2016/ink" xmlns:am3d="http://schemas.microsoft.com/office/drawing/2017/model3d" xmlns:o="urn:schemas-microsoft-com:office:office" xmlns:oel="http://schemas.microsoft.com/office/2019/extlst" xmlns:r="http://schemas.openxmlformats.org/officeDocument/2006/relationships" xmlns:m="http://schemas.openxmlformats.org/officeDocument/2006/math" xmlns:v="urn:schemas-microsoft-com:vml" xmlns:wp14="http://schemas.microsoft.com/office/word/2010/wordprocessingDrawing" xmlns:wp="http://schemas.openxmlformats.org/drawingml/2006/wordprocessingDrawing" xmlns:w10="urn:schemas-microsoft-com:office:word" xmlns:w="http://schemas.openxmlformats.org/wordprocessingml/2006/main" xmlns:w14="http://schemas.microsoft.com/office/word/2010/wordml" xmlns:w15="http://schemas.microsoft.com/office/word/2012/wordml" xmlns:w16cex="http://schemas.microsoft.com/office/word/2018/wordml/cex" xmlns:w16cid="http://schemas.microsoft.com/office/word/2016/wordml/cid" xmlns:w16="http://schemas.microsoft.com/office/word/2018/wordml" xmlns:w16du="http://schemas.microsoft.com/office/word/2023/wordml/word16du" xmlns:w16sdtdh="http://schemas.microsoft.com/office/word/2020/wordml/sdtdatahash" xmlns:w16sdtfl="http://schemas.microsoft.com/office/word/2024/wordml/sdtformatlock" xmlns:w16se="http://schemas.microsoft.com/office/word/2015/wordml/symex" xmlns:wpg="http://schemas.microsoft.com/office/word/2010/wordprocessingGroup" xmlns:wpi="http://schemas.microsoft.com/office/word/2010/wordprocessingInk" xmlns:wne="http://schemas.microsoft.com/office/word/2006/wordml" xmlns:wps="http://schemas.microsoft.com/office/word/2010/wordprocessingShape" mc:Ignorable="w14 w15 w16se w16cid w16 w16cex w16sdtdh w16sdtfl w16du wp14">
+<w:document xmlns:wpc="http://schemas.microsoft.com/office/word/2010/wordprocessingCanvas" xmlns:cx="http://schemas.microsoft.com/office/drawing/2014/chartex" xmlns:cx1="http://schemas.microsoft.com/office/drawing/2015/9/8/chartex" xmlns:cx2="http://schemas.microsoft.com/office/drawing/2015/10/21/chartex" xmlns:cx3="http://schemas.microsoft.com/office/drawing/2016/5/9/chartex" xmlns:cx4="http://schemas.microsoft.com/office/drawing/2016/5/10/chartex" xmlns:cx5="http://schemas.microsoft.com/office/drawing/2016/5/11/chartex" xmlns:cx6="http://schemas.microsoft.com/office/drawing/2016/5/12/chartex" xmlns:cx7="http://schemas.microsoft.com/office/drawing/2016/5/13/chartex" xmlns:cx8="http://schemas.microsoft.com/office/drawing/2016/5/14/chartex" xmlns:mc="http://schemas.openxmlformats.org/markup-compatibility/2006" xmlns:aink="http://schemas.microsoft.com/office/drawing/2016/ink" xmlns:am3d="http://schemas.microsoft.com/office/drawing/2017/model3d" xmlns:o="urn:schemas-microsoft-com:office:office" xmlns:oel="http://schemas.microsoft.com/office/2019/extlst" xmlns:r="http://schemas.openxmlformats.org/officeDocument/2006/relationships" xmlns:m="http://schemas.openxmlformats.org/officeDocument/2006/math" xmlns:v="urn:schemas-microsoft-com:vml" xmlns:wp14="http://schemas.microsoft.com/office/word/2010/wordprocessingDrawing" xmlns:wp="http://schemas.openxmlformats.org/drawingml/2006/wordprocessingDrawing" xmlns:w10="urn:schemas-microsoft-com:office:word" xmlns:w="http://schemas.openxmlformats.org/wordprocessingml/2006/main" xmlns:w14="http://schemas.microsoft.com/office/word/2010/wordml" xmlns:w15="http://schemas.microsoft.com/office/word/2012/wordml" xmlns:w16cex="http://schemas.microsoft.com/office/word/2018/wordml/cex" xmlns:w16cid="http://schemas.microsoft.com/office/word/2016/wordml/cid" xmlns:w16="http://schemas.microsoft.com/office/word/2018/wordml" xmlns:w16sdtdh="http://schemas.microsoft.com/office/word/2020/wordml/sdtdatahash" xmlns:w16se="http://schemas.microsoft.com/office/word/2015/wordml/symex" xmlns:wpg="http://schemas.microsoft.com/office/word/2010/wordprocessingGroup" xmlns:wpi="http://schemas.microsoft.com/office/word/2010/wordprocessingInk" xmlns:wne="http://schemas.microsoft.com/office/word/2006/wordml" xmlns:wps="http://schemas.microsoft.com/office/word/2010/wordprocessingShape" mc:Ignorable="w14 w15 w16se w16cid w16 w16cex w16sdtdh wp14">
   <w:body>
     <w:p>
       <w:pPr>
@@ -31,7 +31,7 @@
           <w:noProof/>
         </w:rPr>
         <w:drawing>
-          <wp:anchor distT="0" distB="0" distL="114300" distR="114300" simplePos="0" relativeHeight="251658240" behindDoc="0" locked="0" layoutInCell="1" allowOverlap="1" wp14:anchorId="74EC2E59" wp14:editId="6F37FE92">
+          <wp:anchor distT="0" distB="0" distL="114300" distR="114300" simplePos="0" relativeHeight="251658240" behindDoc="0" locked="0" layoutInCell="1" allowOverlap="1" wp14:anchorId="74EC2E59" wp14:editId="5358B23A">
             <wp:simplePos x="0" y="0"/>
             <wp:positionH relativeFrom="column">
               <wp:posOffset>1380449</wp:posOffset>
@@ -54,7 +54,7 @@
                     <pic:cNvPicPr/>
                   </pic:nvPicPr>
                   <pic:blipFill>
-                    <a:blip r:embed="rId4" cstate="print">
+                    <a:blip r:embed="rId5" cstate="print">
                       <a:extLst>
                         <a:ext uri="{28A0092B-C50C-407E-A947-70E740481C1C}">
                           <a14:useLocalDpi xmlns:a14="http://schemas.microsoft.com/office/drawing/2010/main" val="0"/>
@@ -266,6 +266,2594 @@
         </w:rPr>
       </w:pPr>
     </w:p>
+    <w:p>
+      <w:pPr>
+        <w:rPr>
+          <w:i/>
+          <w:iCs/>
+        </w:rPr>
+      </w:pPr>
+      <w:r>
+        <w:rPr>
+          <w:b/>
+          <w:bCs/>
+        </w:rPr>
+        <w:t>Definition</w:t>
+      </w:r>
+      <w:r>
+        <w:t xml:space="preserve"> </w:t>
+      </w:r>
+      <w:r>
+        <w:rPr>
+          <w:i/>
+          <w:iCs/>
+        </w:rPr>
+        <w:t>Riemannian space</w:t>
+      </w:r>
+      <w:r>
+        <w:rPr>
+          <w:i/>
+          <w:iCs/>
+        </w:rPr>
+        <w:t xml:space="preserve"> (manifold)</w:t>
+      </w:r>
+    </w:p>
+    <w:p>
+      <w:r>
+        <w:t xml:space="preserve">  Informally, </w:t>
+      </w:r>
+      <w:r>
+        <w:rPr>
+          <w:i/>
+          <w:iCs/>
+        </w:rPr>
+        <w:t>Riemannian space</w:t>
+      </w:r>
+      <w:r>
+        <w:t xml:space="preserve"> is a smooth space equipped with a </w:t>
+      </w:r>
+      <w:r>
+        <w:rPr>
+          <w:i/>
+          <w:iCs/>
+        </w:rPr>
+        <w:t>Riemannian metric</w:t>
+      </w:r>
+      <w:r>
+        <w:t>, which acts as a locally varying tape measure for calculating lengths, angles, and volumes directly on a curved surface without embedding it in high-dimensional space.</w:t>
+      </w:r>
+    </w:p>
+    <w:p>
+      <w:r>
+        <w:t xml:space="preserve">  Formally, a Riemannian manifold (</w:t>
+      </w:r>
+      <m:oMath>
+        <m:r>
+          <m:rPr>
+            <m:scr m:val="script"/>
+          </m:rPr>
+          <w:rPr>
+            <w:rFonts w:ascii="Cambria Math" w:hAnsi="Cambria Math"/>
+          </w:rPr>
+          <m:t>M,</m:t>
+        </m:r>
+        <m:r>
+          <m:rPr>
+            <m:scr m:val="fraktur"/>
+          </m:rPr>
+          <w:rPr>
+            <w:rFonts w:ascii="Cambria Math" w:hAnsi="Cambria Math"/>
+          </w:rPr>
+          <m:t>g</m:t>
+        </m:r>
+      </m:oMath>
+      <w:r>
+        <w:t>) consists of two components:</w:t>
+      </w:r>
+    </w:p>
+    <w:p>
+      <w:pPr>
+        <w:rPr>
+          <w:rFonts w:eastAsiaTheme="minorEastAsia"/>
+        </w:rPr>
+      </w:pPr>
+      <w:r>
+        <w:t xml:space="preserve">  1 ) The Manifold </w:t>
+      </w:r>
+      <m:oMath>
+        <m:r>
+          <m:rPr>
+            <m:scr m:val="script"/>
+          </m:rPr>
+          <w:rPr>
+            <w:rFonts w:ascii="Cambria Math" w:hAnsi="Cambria Math"/>
+          </w:rPr>
+          <m:t>M</m:t>
+        </m:r>
+      </m:oMath>
+      <w:r>
+        <w:rPr>
+          <w:rFonts w:eastAsiaTheme="minorEastAsia"/>
+        </w:rPr>
+        <w:t xml:space="preserve"> </w:t>
+      </w:r>
+      <w:r>
+        <w:rPr>
+          <w:rFonts w:eastAsiaTheme="minorEastAsia"/>
+        </w:rPr>
+        <w:t xml:space="preserve">: a topological space that locally resembles flat Euclidean space </w:t>
+      </w:r>
+      <m:oMath>
+        <m:sSup>
+          <m:sSupPr>
+            <m:ctrlPr>
+              <w:rPr>
+                <w:rFonts w:ascii="Cambria Math" w:eastAsiaTheme="minorEastAsia" w:hAnsi="Cambria Math"/>
+                <w:i/>
+              </w:rPr>
+            </m:ctrlPr>
+          </m:sSupPr>
+          <m:e>
+            <m:r>
+              <m:rPr>
+                <m:scr m:val="double-struck"/>
+              </m:rPr>
+              <w:rPr>
+                <w:rFonts w:ascii="Cambria Math" w:eastAsiaTheme="minorEastAsia" w:hAnsi="Cambria Math"/>
+              </w:rPr>
+              <m:t>R</m:t>
+            </m:r>
+          </m:e>
+          <m:sup>
+            <m:r>
+              <w:rPr>
+                <w:rFonts w:ascii="Cambria Math" w:eastAsiaTheme="minorEastAsia" w:hAnsi="Cambria Math"/>
+              </w:rPr>
+              <m:t>n</m:t>
+            </m:r>
+          </m:sup>
+        </m:sSup>
+      </m:oMath>
+    </w:p>
+    <w:p>
+      <w:pPr>
+        <w:rPr>
+          <w:rFonts w:eastAsiaTheme="minorEastAsia"/>
+        </w:rPr>
+      </w:pPr>
+      <w:r>
+        <w:rPr>
+          <w:rFonts w:eastAsiaTheme="minorEastAsia"/>
+        </w:rPr>
+        <w:t xml:space="preserve">  2 ) The Metric Tensor </w:t>
+      </w:r>
+      <m:oMath>
+        <m:r>
+          <m:rPr>
+            <m:scr m:val="fraktur"/>
+          </m:rPr>
+          <w:rPr>
+            <w:rFonts w:ascii="Cambria Math" w:hAnsi="Cambria Math"/>
+          </w:rPr>
+          <m:t>g</m:t>
+        </m:r>
+      </m:oMath>
+      <w:r>
+        <w:rPr>
+          <w:rFonts w:eastAsiaTheme="minorEastAsia"/>
+        </w:rPr>
+        <w:t xml:space="preserve"> : a choice of an inner product </w:t>
+      </w:r>
+      <m:oMath>
+        <m:sSub>
+          <m:sSubPr>
+            <m:ctrlPr>
+              <w:rPr>
+                <w:rFonts w:ascii="Cambria Math" w:eastAsiaTheme="minorEastAsia" w:hAnsi="Cambria Math"/>
+                <w:i/>
+              </w:rPr>
+            </m:ctrlPr>
+          </m:sSubPr>
+          <m:e>
+            <m:r>
+              <w:rPr>
+                <w:rFonts w:ascii="Cambria Math" w:eastAsiaTheme="minorEastAsia" w:hAnsi="Cambria Math"/>
+              </w:rPr>
+              <m:t>g</m:t>
+            </m:r>
+          </m:e>
+          <m:sub>
+            <m:r>
+              <w:rPr>
+                <w:rFonts w:ascii="Cambria Math" w:eastAsiaTheme="minorEastAsia" w:hAnsi="Cambria Math"/>
+              </w:rPr>
+              <m:t>p</m:t>
+            </m:r>
+          </m:sub>
+        </m:sSub>
+      </m:oMath>
+      <w:r>
+        <w:rPr>
+          <w:rFonts w:eastAsiaTheme="minorEastAsia"/>
+        </w:rPr>
+        <w:t xml:space="preserve"> on the tangent space </w:t>
+      </w:r>
+      <m:oMath>
+        <m:sSub>
+          <m:sSubPr>
+            <m:ctrlPr>
+              <w:rPr>
+                <w:rFonts w:ascii="Cambria Math" w:eastAsiaTheme="minorEastAsia" w:hAnsi="Cambria Math"/>
+                <w:i/>
+              </w:rPr>
+            </m:ctrlPr>
+          </m:sSubPr>
+          <m:e>
+            <m:r>
+              <m:rPr>
+                <m:scr m:val="script"/>
+              </m:rPr>
+              <w:rPr>
+                <w:rFonts w:ascii="Cambria Math" w:eastAsiaTheme="minorEastAsia" w:hAnsi="Cambria Math"/>
+              </w:rPr>
+              <m:t>T</m:t>
+            </m:r>
+          </m:e>
+          <m:sub>
+            <m:r>
+              <w:rPr>
+                <w:rFonts w:ascii="Cambria Math" w:eastAsiaTheme="minorEastAsia" w:hAnsi="Cambria Math"/>
+              </w:rPr>
+              <m:t>p</m:t>
+            </m:r>
+          </m:sub>
+        </m:sSub>
+        <m:r>
+          <m:rPr>
+            <m:scr m:val="script"/>
+          </m:rPr>
+          <w:rPr>
+            <w:rFonts w:ascii="Cambria Math" w:hAnsi="Cambria Math"/>
+          </w:rPr>
+          <m:t>M</m:t>
+        </m:r>
+      </m:oMath>
+      <w:r>
+        <w:rPr>
+          <w:rFonts w:eastAsiaTheme="minorEastAsia"/>
+        </w:rPr>
+        <w:t xml:space="preserve"> at each point </w:t>
+      </w:r>
+      <m:oMath>
+        <m:r>
+          <w:rPr>
+            <w:rFonts w:ascii="Cambria Math" w:eastAsiaTheme="minorEastAsia" w:hAnsi="Cambria Math"/>
+          </w:rPr>
+          <m:t>p</m:t>
+        </m:r>
+        <m:r>
+          <w:rPr>
+            <w:rFonts w:ascii="Cambria Math" w:eastAsiaTheme="minorEastAsia" w:hAnsi="Cambria Math"/>
+          </w:rPr>
+          <m:t>∈</m:t>
+        </m:r>
+        <m:r>
+          <m:rPr>
+            <m:scr m:val="script"/>
+          </m:rPr>
+          <w:rPr>
+            <w:rFonts w:ascii="Cambria Math" w:hAnsi="Cambria Math"/>
+          </w:rPr>
+          <m:t>M</m:t>
+        </m:r>
+      </m:oMath>
+      <w:r>
+        <w:rPr>
+          <w:rFonts w:eastAsiaTheme="minorEastAsia"/>
+        </w:rPr>
+        <w:t xml:space="preserve"> that varies smoothly from point to point.</w:t>
+      </w:r>
+    </w:p>
+    <w:p>
+      <w:pPr>
+        <w:rPr>
+          <w:rFonts w:eastAsiaTheme="minorEastAsia"/>
+        </w:rPr>
+      </w:pPr>
+      <w:r>
+        <w:lastRenderedPageBreak/>
+        <w:t xml:space="preserve">For any two tangent vectors </w:t>
+      </w:r>
+      <m:oMath>
+        <m:r>
+          <w:rPr>
+            <w:rFonts w:ascii="Cambria Math" w:hAnsi="Cambria Math"/>
+          </w:rPr>
+          <m:t>u, v</m:t>
+        </m:r>
+        <m:r>
+          <w:rPr>
+            <w:rFonts w:ascii="Cambria Math" w:hAnsi="Cambria Math"/>
+          </w:rPr>
+          <m:t>∈</m:t>
+        </m:r>
+        <m:sSub>
+          <m:sSubPr>
+            <m:ctrlPr>
+              <w:rPr>
+                <w:rFonts w:ascii="Cambria Math" w:eastAsiaTheme="minorEastAsia" w:hAnsi="Cambria Math"/>
+                <w:i/>
+              </w:rPr>
+            </m:ctrlPr>
+          </m:sSubPr>
+          <m:e>
+            <m:r>
+              <m:rPr>
+                <m:scr m:val="script"/>
+              </m:rPr>
+              <w:rPr>
+                <w:rFonts w:ascii="Cambria Math" w:eastAsiaTheme="minorEastAsia" w:hAnsi="Cambria Math"/>
+              </w:rPr>
+              <m:t>T</m:t>
+            </m:r>
+          </m:e>
+          <m:sub>
+            <m:r>
+              <w:rPr>
+                <w:rFonts w:ascii="Cambria Math" w:eastAsiaTheme="minorEastAsia" w:hAnsi="Cambria Math"/>
+              </w:rPr>
+              <m:t>p</m:t>
+            </m:r>
+          </m:sub>
+        </m:sSub>
+        <m:r>
+          <m:rPr>
+            <m:scr m:val="script"/>
+          </m:rPr>
+          <w:rPr>
+            <w:rFonts w:ascii="Cambria Math" w:hAnsi="Cambria Math"/>
+          </w:rPr>
+          <m:t>M</m:t>
+        </m:r>
+      </m:oMath>
+      <w:r>
+        <w:rPr>
+          <w:rFonts w:eastAsiaTheme="minorEastAsia"/>
+        </w:rPr>
+        <w:t xml:space="preserve">, the metric </w:t>
+      </w:r>
+      <m:oMath>
+        <m:sSub>
+          <m:sSubPr>
+            <m:ctrlPr>
+              <w:rPr>
+                <w:rFonts w:ascii="Cambria Math" w:eastAsiaTheme="minorEastAsia" w:hAnsi="Cambria Math"/>
+                <w:i/>
+              </w:rPr>
+            </m:ctrlPr>
+          </m:sSubPr>
+          <m:e>
+            <m:r>
+              <w:rPr>
+                <w:rFonts w:ascii="Cambria Math" w:eastAsiaTheme="minorEastAsia" w:hAnsi="Cambria Math"/>
+              </w:rPr>
+              <m:t>g</m:t>
+            </m:r>
+          </m:e>
+          <m:sub>
+            <m:r>
+              <w:rPr>
+                <w:rFonts w:ascii="Cambria Math" w:eastAsiaTheme="minorEastAsia" w:hAnsi="Cambria Math"/>
+              </w:rPr>
+              <m:t>p</m:t>
+            </m:r>
+          </m:sub>
+        </m:sSub>
+        <m:d>
+          <m:dPr>
+            <m:ctrlPr>
+              <w:rPr>
+                <w:rFonts w:ascii="Cambria Math" w:eastAsiaTheme="minorEastAsia" w:hAnsi="Cambria Math"/>
+                <w:i/>
+              </w:rPr>
+            </m:ctrlPr>
+          </m:dPr>
+          <m:e>
+            <m:r>
+              <w:rPr>
+                <w:rFonts w:ascii="Cambria Math" w:eastAsiaTheme="minorEastAsia" w:hAnsi="Cambria Math"/>
+              </w:rPr>
+              <m:t>u,v</m:t>
+            </m:r>
+          </m:e>
+        </m:d>
+      </m:oMath>
+      <w:r>
+        <w:rPr>
+          <w:rFonts w:eastAsiaTheme="minorEastAsia"/>
+        </w:rPr>
+        <w:t xml:space="preserve"> returns a real number satisfying three properties:</w:t>
+      </w:r>
+    </w:p>
+    <w:p>
+      <w:pPr>
+        <w:rPr>
+          <w:rFonts w:eastAsiaTheme="minorEastAsia"/>
+        </w:rPr>
+      </w:pPr>
+    </w:p>
+    <w:p>
+      <w:pPr>
+        <w:pStyle w:val="ListParagraph"/>
+        <w:numPr>
+          <w:ilvl w:val="0"/>
+          <w:numId w:val="1"/>
+        </w:numPr>
+      </w:pPr>
+      <w:r>
+        <w:rPr>
+          <w:rFonts w:eastAsiaTheme="minorEastAsia"/>
+          <w:b/>
+          <w:bCs/>
+        </w:rPr>
+        <w:t>bilinear</w:t>
+      </w:r>
+      <w:r>
+        <w:rPr>
+          <w:rFonts w:eastAsiaTheme="minorEastAsia"/>
+        </w:rPr>
+        <w:t xml:space="preserve"> in both arguments i.e. </w:t>
+      </w:r>
+      <w:r>
+        <w:rPr>
+          <w:rFonts w:eastAsiaTheme="minorEastAsia"/>
+        </w:rPr>
+        <w:t xml:space="preserve"> </w:t>
+      </w:r>
+      <m:oMath>
+        <m:sSub>
+          <m:sSubPr>
+            <m:ctrlPr>
+              <w:rPr>
+                <w:rFonts w:ascii="Cambria Math" w:eastAsiaTheme="minorEastAsia" w:hAnsi="Cambria Math"/>
+                <w:i/>
+              </w:rPr>
+            </m:ctrlPr>
+          </m:sSubPr>
+          <m:e>
+            <m:r>
+              <w:rPr>
+                <w:rFonts w:ascii="Cambria Math" w:eastAsiaTheme="minorEastAsia" w:hAnsi="Cambria Math"/>
+              </w:rPr>
+              <m:t>g</m:t>
+            </m:r>
+          </m:e>
+          <m:sub>
+            <m:r>
+              <w:rPr>
+                <w:rFonts w:ascii="Cambria Math" w:eastAsiaTheme="minorEastAsia" w:hAnsi="Cambria Math"/>
+              </w:rPr>
+              <m:t>p</m:t>
+            </m:r>
+          </m:sub>
+        </m:sSub>
+        <m:d>
+          <m:dPr>
+            <m:ctrlPr>
+              <w:rPr>
+                <w:rFonts w:ascii="Cambria Math" w:eastAsiaTheme="minorEastAsia" w:hAnsi="Cambria Math"/>
+                <w:i/>
+              </w:rPr>
+            </m:ctrlPr>
+          </m:dPr>
+          <m:e>
+            <m:sSub>
+              <m:sSubPr>
+                <m:ctrlPr>
+                  <w:rPr>
+                    <w:rFonts w:ascii="Cambria Math" w:eastAsiaTheme="minorEastAsia" w:hAnsi="Cambria Math"/>
+                    <w:i/>
+                  </w:rPr>
+                </m:ctrlPr>
+              </m:sSubPr>
+              <m:e>
+                <m:r>
+                  <w:rPr>
+                    <w:rFonts w:ascii="Cambria Math" w:eastAsiaTheme="minorEastAsia" w:hAnsi="Cambria Math"/>
+                  </w:rPr>
+                  <m:t>u</m:t>
+                </m:r>
+              </m:e>
+              <m:sub>
+                <m:r>
+                  <w:rPr>
+                    <w:rFonts w:ascii="Cambria Math" w:eastAsiaTheme="minorEastAsia" w:hAnsi="Cambria Math"/>
+                  </w:rPr>
+                  <m:t>1</m:t>
+                </m:r>
+              </m:sub>
+            </m:sSub>
+            <m:r>
+              <w:rPr>
+                <w:rFonts w:ascii="Cambria Math" w:eastAsiaTheme="minorEastAsia" w:hAnsi="Cambria Math"/>
+              </w:rPr>
+              <m:t>+</m:t>
+            </m:r>
+            <m:sSub>
+              <m:sSubPr>
+                <m:ctrlPr>
+                  <w:rPr>
+                    <w:rFonts w:ascii="Cambria Math" w:eastAsiaTheme="minorEastAsia" w:hAnsi="Cambria Math"/>
+                    <w:i/>
+                  </w:rPr>
+                </m:ctrlPr>
+              </m:sSubPr>
+              <m:e>
+                <m:r>
+                  <w:rPr>
+                    <w:rFonts w:ascii="Cambria Math" w:eastAsiaTheme="minorEastAsia" w:hAnsi="Cambria Math"/>
+                  </w:rPr>
+                  <m:t>u</m:t>
+                </m:r>
+              </m:e>
+              <m:sub>
+                <m:r>
+                  <w:rPr>
+                    <w:rFonts w:ascii="Cambria Math" w:eastAsiaTheme="minorEastAsia" w:hAnsi="Cambria Math"/>
+                  </w:rPr>
+                  <m:t>2</m:t>
+                </m:r>
+              </m:sub>
+            </m:sSub>
+            <m:r>
+              <w:rPr>
+                <w:rFonts w:ascii="Cambria Math" w:eastAsiaTheme="minorEastAsia" w:hAnsi="Cambria Math"/>
+              </w:rPr>
+              <m:t>,v</m:t>
+            </m:r>
+          </m:e>
+        </m:d>
+        <m:r>
+          <w:rPr>
+            <w:rFonts w:ascii="Cambria Math" w:eastAsiaTheme="minorEastAsia" w:hAnsi="Cambria Math"/>
+          </w:rPr>
+          <m:t>=</m:t>
+        </m:r>
+        <m:sSub>
+          <m:sSubPr>
+            <m:ctrlPr>
+              <w:rPr>
+                <w:rFonts w:ascii="Cambria Math" w:eastAsiaTheme="minorEastAsia" w:hAnsi="Cambria Math"/>
+                <w:i/>
+              </w:rPr>
+            </m:ctrlPr>
+          </m:sSubPr>
+          <m:e>
+            <m:r>
+              <w:rPr>
+                <w:rFonts w:ascii="Cambria Math" w:eastAsiaTheme="minorEastAsia" w:hAnsi="Cambria Math"/>
+              </w:rPr>
+              <m:t>g</m:t>
+            </m:r>
+          </m:e>
+          <m:sub>
+            <m:r>
+              <w:rPr>
+                <w:rFonts w:ascii="Cambria Math" w:eastAsiaTheme="minorEastAsia" w:hAnsi="Cambria Math"/>
+              </w:rPr>
+              <m:t>p</m:t>
+            </m:r>
+          </m:sub>
+        </m:sSub>
+        <m:d>
+          <m:dPr>
+            <m:ctrlPr>
+              <w:rPr>
+                <w:rFonts w:ascii="Cambria Math" w:eastAsiaTheme="minorEastAsia" w:hAnsi="Cambria Math"/>
+                <w:i/>
+              </w:rPr>
+            </m:ctrlPr>
+          </m:dPr>
+          <m:e>
+            <m:sSub>
+              <m:sSubPr>
+                <m:ctrlPr>
+                  <w:rPr>
+                    <w:rFonts w:ascii="Cambria Math" w:eastAsiaTheme="minorEastAsia" w:hAnsi="Cambria Math"/>
+                    <w:i/>
+                  </w:rPr>
+                </m:ctrlPr>
+              </m:sSubPr>
+              <m:e>
+                <m:r>
+                  <w:rPr>
+                    <w:rFonts w:ascii="Cambria Math" w:eastAsiaTheme="minorEastAsia" w:hAnsi="Cambria Math"/>
+                  </w:rPr>
+                  <m:t>u</m:t>
+                </m:r>
+              </m:e>
+              <m:sub>
+                <m:r>
+                  <w:rPr>
+                    <w:rFonts w:ascii="Cambria Math" w:eastAsiaTheme="minorEastAsia" w:hAnsi="Cambria Math"/>
+                  </w:rPr>
+                  <m:t>1</m:t>
+                </m:r>
+              </m:sub>
+            </m:sSub>
+            <m:r>
+              <w:rPr>
+                <w:rFonts w:ascii="Cambria Math" w:eastAsiaTheme="minorEastAsia" w:hAnsi="Cambria Math"/>
+              </w:rPr>
+              <m:t>,v</m:t>
+            </m:r>
+          </m:e>
+        </m:d>
+        <m:r>
+          <w:rPr>
+            <w:rFonts w:ascii="Cambria Math" w:eastAsiaTheme="minorEastAsia" w:hAnsi="Cambria Math"/>
+          </w:rPr>
+          <m:t>+</m:t>
+        </m:r>
+        <m:sSub>
+          <m:sSubPr>
+            <m:ctrlPr>
+              <w:rPr>
+                <w:rFonts w:ascii="Cambria Math" w:eastAsiaTheme="minorEastAsia" w:hAnsi="Cambria Math"/>
+                <w:i/>
+              </w:rPr>
+            </m:ctrlPr>
+          </m:sSubPr>
+          <m:e>
+            <m:r>
+              <w:rPr>
+                <w:rFonts w:ascii="Cambria Math" w:eastAsiaTheme="minorEastAsia" w:hAnsi="Cambria Math"/>
+              </w:rPr>
+              <m:t>g</m:t>
+            </m:r>
+          </m:e>
+          <m:sub>
+            <m:r>
+              <w:rPr>
+                <w:rFonts w:ascii="Cambria Math" w:eastAsiaTheme="minorEastAsia" w:hAnsi="Cambria Math"/>
+              </w:rPr>
+              <m:t>p</m:t>
+            </m:r>
+          </m:sub>
+        </m:sSub>
+        <m:d>
+          <m:dPr>
+            <m:ctrlPr>
+              <w:rPr>
+                <w:rFonts w:ascii="Cambria Math" w:eastAsiaTheme="minorEastAsia" w:hAnsi="Cambria Math"/>
+                <w:i/>
+              </w:rPr>
+            </m:ctrlPr>
+          </m:dPr>
+          <m:e>
+            <m:sSub>
+              <m:sSubPr>
+                <m:ctrlPr>
+                  <w:rPr>
+                    <w:rFonts w:ascii="Cambria Math" w:eastAsiaTheme="minorEastAsia" w:hAnsi="Cambria Math"/>
+                    <w:i/>
+                  </w:rPr>
+                </m:ctrlPr>
+              </m:sSubPr>
+              <m:e>
+                <m:r>
+                  <w:rPr>
+                    <w:rFonts w:ascii="Cambria Math" w:eastAsiaTheme="minorEastAsia" w:hAnsi="Cambria Math"/>
+                  </w:rPr>
+                  <m:t>u</m:t>
+                </m:r>
+              </m:e>
+              <m:sub>
+                <m:r>
+                  <w:rPr>
+                    <w:rFonts w:ascii="Cambria Math" w:eastAsiaTheme="minorEastAsia" w:hAnsi="Cambria Math"/>
+                  </w:rPr>
+                  <m:t>2</m:t>
+                </m:r>
+              </m:sub>
+            </m:sSub>
+            <m:r>
+              <w:rPr>
+                <w:rFonts w:ascii="Cambria Math" w:eastAsiaTheme="minorEastAsia" w:hAnsi="Cambria Math"/>
+              </w:rPr>
+              <m:t>,v</m:t>
+            </m:r>
+          </m:e>
+        </m:d>
+      </m:oMath>
+      <w:r>
+        <w:rPr>
+          <w:rFonts w:eastAsiaTheme="minorEastAsia"/>
+        </w:rPr>
+        <w:t xml:space="preserve"> </w:t>
+      </w:r>
+      <m:oMath>
+        <m:r>
+          <w:rPr>
+            <w:rFonts w:ascii="Cambria Math" w:eastAsiaTheme="minorEastAsia" w:hAnsi="Cambria Math"/>
+          </w:rPr>
+          <m:t>∧</m:t>
+        </m:r>
+        <m:sSub>
+          <m:sSubPr>
+            <m:ctrlPr>
+              <w:rPr>
+                <w:rFonts w:ascii="Cambria Math" w:eastAsiaTheme="minorEastAsia" w:hAnsi="Cambria Math"/>
+                <w:i/>
+              </w:rPr>
+            </m:ctrlPr>
+          </m:sSubPr>
+          <m:e>
+            <m:r>
+              <w:rPr>
+                <w:rFonts w:ascii="Cambria Math" w:eastAsiaTheme="minorEastAsia" w:hAnsi="Cambria Math"/>
+              </w:rPr>
+              <m:t>g</m:t>
+            </m:r>
+          </m:e>
+          <m:sub>
+            <m:r>
+              <w:rPr>
+                <w:rFonts w:ascii="Cambria Math" w:eastAsiaTheme="minorEastAsia" w:hAnsi="Cambria Math"/>
+              </w:rPr>
+              <m:t>p</m:t>
+            </m:r>
+          </m:sub>
+        </m:sSub>
+        <m:d>
+          <m:dPr>
+            <m:ctrlPr>
+              <w:rPr>
+                <w:rFonts w:ascii="Cambria Math" w:eastAsiaTheme="minorEastAsia" w:hAnsi="Cambria Math"/>
+                <w:i/>
+              </w:rPr>
+            </m:ctrlPr>
+          </m:dPr>
+          <m:e>
+            <m:r>
+              <w:rPr>
+                <w:rFonts w:ascii="Cambria Math" w:eastAsiaTheme="minorEastAsia" w:hAnsi="Cambria Math"/>
+              </w:rPr>
+              <m:t>u</m:t>
+            </m:r>
+            <m:r>
+              <w:rPr>
+                <w:rFonts w:ascii="Cambria Math" w:eastAsiaTheme="minorEastAsia" w:hAnsi="Cambria Math"/>
+              </w:rPr>
+              <m:t>,</m:t>
+            </m:r>
+            <m:sSub>
+              <m:sSubPr>
+                <m:ctrlPr>
+                  <w:rPr>
+                    <w:rFonts w:ascii="Cambria Math" w:eastAsiaTheme="minorEastAsia" w:hAnsi="Cambria Math"/>
+                    <w:i/>
+                  </w:rPr>
+                </m:ctrlPr>
+              </m:sSubPr>
+              <m:e>
+                <m:r>
+                  <w:rPr>
+                    <w:rFonts w:ascii="Cambria Math" w:eastAsiaTheme="minorEastAsia" w:hAnsi="Cambria Math"/>
+                  </w:rPr>
+                  <m:t>v</m:t>
+                </m:r>
+              </m:e>
+              <m:sub>
+                <m:r>
+                  <w:rPr>
+                    <w:rFonts w:ascii="Cambria Math" w:eastAsiaTheme="minorEastAsia" w:hAnsi="Cambria Math"/>
+                  </w:rPr>
+                  <m:t>1</m:t>
+                </m:r>
+              </m:sub>
+            </m:sSub>
+            <m:r>
+              <w:rPr>
+                <w:rFonts w:ascii="Cambria Math" w:eastAsiaTheme="minorEastAsia" w:hAnsi="Cambria Math"/>
+              </w:rPr>
+              <m:t>+</m:t>
+            </m:r>
+            <m:sSub>
+              <m:sSubPr>
+                <m:ctrlPr>
+                  <w:rPr>
+                    <w:rFonts w:ascii="Cambria Math" w:eastAsiaTheme="minorEastAsia" w:hAnsi="Cambria Math"/>
+                    <w:i/>
+                  </w:rPr>
+                </m:ctrlPr>
+              </m:sSubPr>
+              <m:e>
+                <m:r>
+                  <w:rPr>
+                    <w:rFonts w:ascii="Cambria Math" w:eastAsiaTheme="minorEastAsia" w:hAnsi="Cambria Math"/>
+                  </w:rPr>
+                  <m:t>v</m:t>
+                </m:r>
+              </m:e>
+              <m:sub>
+                <m:r>
+                  <w:rPr>
+                    <w:rFonts w:ascii="Cambria Math" w:eastAsiaTheme="minorEastAsia" w:hAnsi="Cambria Math"/>
+                  </w:rPr>
+                  <m:t>2</m:t>
+                </m:r>
+              </m:sub>
+            </m:sSub>
+          </m:e>
+        </m:d>
+        <m:r>
+          <w:rPr>
+            <w:rFonts w:ascii="Cambria Math" w:eastAsiaTheme="minorEastAsia" w:hAnsi="Cambria Math"/>
+          </w:rPr>
+          <m:t>=</m:t>
+        </m:r>
+        <m:sSub>
+          <m:sSubPr>
+            <m:ctrlPr>
+              <w:rPr>
+                <w:rFonts w:ascii="Cambria Math" w:eastAsiaTheme="minorEastAsia" w:hAnsi="Cambria Math"/>
+                <w:i/>
+              </w:rPr>
+            </m:ctrlPr>
+          </m:sSubPr>
+          <m:e>
+            <m:r>
+              <w:rPr>
+                <w:rFonts w:ascii="Cambria Math" w:eastAsiaTheme="minorEastAsia" w:hAnsi="Cambria Math"/>
+              </w:rPr>
+              <m:t>g</m:t>
+            </m:r>
+          </m:e>
+          <m:sub>
+            <m:r>
+              <w:rPr>
+                <w:rFonts w:ascii="Cambria Math" w:eastAsiaTheme="minorEastAsia" w:hAnsi="Cambria Math"/>
+              </w:rPr>
+              <m:t>p</m:t>
+            </m:r>
+          </m:sub>
+        </m:sSub>
+        <m:d>
+          <m:dPr>
+            <m:ctrlPr>
+              <w:rPr>
+                <w:rFonts w:ascii="Cambria Math" w:eastAsiaTheme="minorEastAsia" w:hAnsi="Cambria Math"/>
+                <w:i/>
+              </w:rPr>
+            </m:ctrlPr>
+          </m:dPr>
+          <m:e>
+            <m:r>
+              <w:rPr>
+                <w:rFonts w:ascii="Cambria Math" w:eastAsiaTheme="minorEastAsia" w:hAnsi="Cambria Math"/>
+              </w:rPr>
+              <m:t>u</m:t>
+            </m:r>
+            <m:r>
+              <w:rPr>
+                <w:rFonts w:ascii="Cambria Math" w:eastAsiaTheme="minorEastAsia" w:hAnsi="Cambria Math"/>
+              </w:rPr>
+              <m:t>,</m:t>
+            </m:r>
+            <m:sSub>
+              <m:sSubPr>
+                <m:ctrlPr>
+                  <w:rPr>
+                    <w:rFonts w:ascii="Cambria Math" w:eastAsiaTheme="minorEastAsia" w:hAnsi="Cambria Math"/>
+                    <w:i/>
+                  </w:rPr>
+                </m:ctrlPr>
+              </m:sSubPr>
+              <m:e>
+                <m:r>
+                  <w:rPr>
+                    <w:rFonts w:ascii="Cambria Math" w:eastAsiaTheme="minorEastAsia" w:hAnsi="Cambria Math"/>
+                  </w:rPr>
+                  <m:t>v</m:t>
+                </m:r>
+              </m:e>
+              <m:sub>
+                <m:r>
+                  <w:rPr>
+                    <w:rFonts w:ascii="Cambria Math" w:eastAsiaTheme="minorEastAsia" w:hAnsi="Cambria Math"/>
+                  </w:rPr>
+                  <m:t>1</m:t>
+                </m:r>
+              </m:sub>
+            </m:sSub>
+          </m:e>
+        </m:d>
+        <m:r>
+          <w:rPr>
+            <w:rFonts w:ascii="Cambria Math" w:eastAsiaTheme="minorEastAsia" w:hAnsi="Cambria Math"/>
+          </w:rPr>
+          <m:t>+</m:t>
+        </m:r>
+        <m:sSub>
+          <m:sSubPr>
+            <m:ctrlPr>
+              <w:rPr>
+                <w:rFonts w:ascii="Cambria Math" w:eastAsiaTheme="minorEastAsia" w:hAnsi="Cambria Math"/>
+                <w:i/>
+              </w:rPr>
+            </m:ctrlPr>
+          </m:sSubPr>
+          <m:e>
+            <m:r>
+              <w:rPr>
+                <w:rFonts w:ascii="Cambria Math" w:eastAsiaTheme="minorEastAsia" w:hAnsi="Cambria Math"/>
+              </w:rPr>
+              <m:t>g</m:t>
+            </m:r>
+          </m:e>
+          <m:sub>
+            <m:r>
+              <w:rPr>
+                <w:rFonts w:ascii="Cambria Math" w:eastAsiaTheme="minorEastAsia" w:hAnsi="Cambria Math"/>
+              </w:rPr>
+              <m:t>p</m:t>
+            </m:r>
+          </m:sub>
+        </m:sSub>
+        <m:d>
+          <m:dPr>
+            <m:ctrlPr>
+              <w:rPr>
+                <w:rFonts w:ascii="Cambria Math" w:eastAsiaTheme="minorEastAsia" w:hAnsi="Cambria Math"/>
+                <w:i/>
+              </w:rPr>
+            </m:ctrlPr>
+          </m:dPr>
+          <m:e>
+            <m:r>
+              <w:rPr>
+                <w:rFonts w:ascii="Cambria Math" w:eastAsiaTheme="minorEastAsia" w:hAnsi="Cambria Math"/>
+              </w:rPr>
+              <m:t>u</m:t>
+            </m:r>
+            <m:r>
+              <w:rPr>
+                <w:rFonts w:ascii="Cambria Math" w:eastAsiaTheme="minorEastAsia" w:hAnsi="Cambria Math"/>
+              </w:rPr>
+              <m:t>,</m:t>
+            </m:r>
+            <m:sSub>
+              <m:sSubPr>
+                <m:ctrlPr>
+                  <w:rPr>
+                    <w:rFonts w:ascii="Cambria Math" w:eastAsiaTheme="minorEastAsia" w:hAnsi="Cambria Math"/>
+                    <w:i/>
+                  </w:rPr>
+                </m:ctrlPr>
+              </m:sSubPr>
+              <m:e>
+                <m:r>
+                  <w:rPr>
+                    <w:rFonts w:ascii="Cambria Math" w:eastAsiaTheme="minorEastAsia" w:hAnsi="Cambria Math"/>
+                  </w:rPr>
+                  <m:t>v</m:t>
+                </m:r>
+              </m:e>
+              <m:sub>
+                <m:r>
+                  <w:rPr>
+                    <w:rFonts w:ascii="Cambria Math" w:eastAsiaTheme="minorEastAsia" w:hAnsi="Cambria Math"/>
+                  </w:rPr>
+                  <m:t>2</m:t>
+                </m:r>
+              </m:sub>
+            </m:sSub>
+          </m:e>
+        </m:d>
+      </m:oMath>
+      <w:r>
+        <w:rPr>
+          <w:rFonts w:eastAsiaTheme="minorEastAsia"/>
+        </w:rPr>
+        <w:t xml:space="preserve"> </w:t>
+      </w:r>
+    </w:p>
+    <w:p>
+      <w:pPr>
+        <w:pStyle w:val="ListParagraph"/>
+        <w:numPr>
+          <w:ilvl w:val="0"/>
+          <w:numId w:val="1"/>
+        </w:numPr>
+      </w:pPr>
+      <w:r>
+        <w:rPr>
+          <w:rFonts w:eastAsiaTheme="minorEastAsia"/>
+          <w:b/>
+          <w:bCs/>
+        </w:rPr>
+        <w:t>symmetric</w:t>
+      </w:r>
+      <w:r>
+        <w:rPr>
+          <w:rFonts w:eastAsiaTheme="minorEastAsia"/>
+        </w:rPr>
+        <w:t xml:space="preserve"> : </w:t>
+      </w:r>
+      <m:oMath>
+        <m:sSub>
+          <m:sSubPr>
+            <m:ctrlPr>
+              <w:rPr>
+                <w:rFonts w:ascii="Cambria Math" w:eastAsiaTheme="minorEastAsia" w:hAnsi="Cambria Math"/>
+                <w:i/>
+              </w:rPr>
+            </m:ctrlPr>
+          </m:sSubPr>
+          <m:e>
+            <m:r>
+              <w:rPr>
+                <w:rFonts w:ascii="Cambria Math" w:eastAsiaTheme="minorEastAsia" w:hAnsi="Cambria Math"/>
+              </w:rPr>
+              <m:t>g</m:t>
+            </m:r>
+          </m:e>
+          <m:sub>
+            <m:r>
+              <w:rPr>
+                <w:rFonts w:ascii="Cambria Math" w:eastAsiaTheme="minorEastAsia" w:hAnsi="Cambria Math"/>
+              </w:rPr>
+              <m:t>p</m:t>
+            </m:r>
+          </m:sub>
+        </m:sSub>
+        <m:d>
+          <m:dPr>
+            <m:ctrlPr>
+              <w:rPr>
+                <w:rFonts w:ascii="Cambria Math" w:eastAsiaTheme="minorEastAsia" w:hAnsi="Cambria Math"/>
+                <w:i/>
+              </w:rPr>
+            </m:ctrlPr>
+          </m:dPr>
+          <m:e>
+            <m:r>
+              <w:rPr>
+                <w:rFonts w:ascii="Cambria Math" w:eastAsiaTheme="minorEastAsia" w:hAnsi="Cambria Math"/>
+              </w:rPr>
+              <m:t>u</m:t>
+            </m:r>
+            <m:r>
+              <w:rPr>
+                <w:rFonts w:ascii="Cambria Math" w:eastAsiaTheme="minorEastAsia" w:hAnsi="Cambria Math"/>
+              </w:rPr>
+              <m:t>,v</m:t>
+            </m:r>
+          </m:e>
+        </m:d>
+        <m:r>
+          <w:rPr>
+            <w:rFonts w:ascii="Cambria Math" w:eastAsiaTheme="minorEastAsia" w:hAnsi="Cambria Math"/>
+          </w:rPr>
+          <m:t>=</m:t>
+        </m:r>
+        <m:sSub>
+          <m:sSubPr>
+            <m:ctrlPr>
+              <w:rPr>
+                <w:rFonts w:ascii="Cambria Math" w:eastAsiaTheme="minorEastAsia" w:hAnsi="Cambria Math"/>
+                <w:i/>
+              </w:rPr>
+            </m:ctrlPr>
+          </m:sSubPr>
+          <m:e>
+            <m:r>
+              <w:rPr>
+                <w:rFonts w:ascii="Cambria Math" w:eastAsiaTheme="minorEastAsia" w:hAnsi="Cambria Math"/>
+              </w:rPr>
+              <m:t>g</m:t>
+            </m:r>
+          </m:e>
+          <m:sub>
+            <m:r>
+              <w:rPr>
+                <w:rFonts w:ascii="Cambria Math" w:eastAsiaTheme="minorEastAsia" w:hAnsi="Cambria Math"/>
+              </w:rPr>
+              <m:t>p</m:t>
+            </m:r>
+          </m:sub>
+        </m:sSub>
+        <m:d>
+          <m:dPr>
+            <m:ctrlPr>
+              <w:rPr>
+                <w:rFonts w:ascii="Cambria Math" w:eastAsiaTheme="minorEastAsia" w:hAnsi="Cambria Math"/>
+                <w:i/>
+              </w:rPr>
+            </m:ctrlPr>
+          </m:dPr>
+          <m:e>
+            <m:r>
+              <w:rPr>
+                <w:rFonts w:ascii="Cambria Math" w:eastAsiaTheme="minorEastAsia" w:hAnsi="Cambria Math"/>
+              </w:rPr>
+              <m:t>v</m:t>
+            </m:r>
+            <m:r>
+              <w:rPr>
+                <w:rFonts w:ascii="Cambria Math" w:eastAsiaTheme="minorEastAsia" w:hAnsi="Cambria Math"/>
+              </w:rPr>
+              <m:t>,</m:t>
+            </m:r>
+            <m:r>
+              <w:rPr>
+                <w:rFonts w:ascii="Cambria Math" w:eastAsiaTheme="minorEastAsia" w:hAnsi="Cambria Math"/>
+              </w:rPr>
+              <m:t>u</m:t>
+            </m:r>
+          </m:e>
+        </m:d>
+      </m:oMath>
+    </w:p>
+    <w:p>
+      <w:pPr>
+        <w:pStyle w:val="ListParagraph"/>
+        <w:numPr>
+          <w:ilvl w:val="0"/>
+          <w:numId w:val="1"/>
+        </w:numPr>
+      </w:pPr>
+      <w:r>
+        <w:rPr>
+          <w:rFonts w:eastAsiaTheme="minorEastAsia"/>
+          <w:b/>
+          <w:bCs/>
+        </w:rPr>
+        <w:t xml:space="preserve">positive-definite: </w:t>
+      </w:r>
+      <m:oMath>
+        <m:sSub>
+          <m:sSubPr>
+            <m:ctrlPr>
+              <w:rPr>
+                <w:rFonts w:ascii="Cambria Math" w:eastAsiaTheme="minorEastAsia" w:hAnsi="Cambria Math"/>
+                <w:i/>
+              </w:rPr>
+            </m:ctrlPr>
+          </m:sSubPr>
+          <m:e>
+            <m:r>
+              <w:rPr>
+                <w:rFonts w:ascii="Cambria Math" w:eastAsiaTheme="minorEastAsia" w:hAnsi="Cambria Math"/>
+              </w:rPr>
+              <m:t>g</m:t>
+            </m:r>
+          </m:e>
+          <m:sub>
+            <m:r>
+              <w:rPr>
+                <w:rFonts w:ascii="Cambria Math" w:eastAsiaTheme="minorEastAsia" w:hAnsi="Cambria Math"/>
+              </w:rPr>
+              <m:t>p</m:t>
+            </m:r>
+          </m:sub>
+        </m:sSub>
+        <m:d>
+          <m:dPr>
+            <m:ctrlPr>
+              <w:rPr>
+                <w:rFonts w:ascii="Cambria Math" w:eastAsiaTheme="minorEastAsia" w:hAnsi="Cambria Math"/>
+                <w:i/>
+              </w:rPr>
+            </m:ctrlPr>
+          </m:dPr>
+          <m:e>
+            <m:r>
+              <w:rPr>
+                <w:rFonts w:ascii="Cambria Math" w:eastAsiaTheme="minorEastAsia" w:hAnsi="Cambria Math"/>
+              </w:rPr>
+              <m:t>u,</m:t>
+            </m:r>
+            <m:r>
+              <w:rPr>
+                <w:rFonts w:ascii="Cambria Math" w:eastAsiaTheme="minorEastAsia" w:hAnsi="Cambria Math"/>
+              </w:rPr>
+              <m:t>u</m:t>
+            </m:r>
+          </m:e>
+        </m:d>
+        <m:r>
+          <w:rPr>
+            <w:rFonts w:ascii="Cambria Math" w:eastAsiaTheme="minorEastAsia" w:hAnsi="Cambria Math"/>
+          </w:rPr>
+          <m:t>&gt;0</m:t>
+        </m:r>
+      </m:oMath>
+      <w:r>
+        <w:rPr>
+          <w:rFonts w:eastAsiaTheme="minorEastAsia"/>
+        </w:rPr>
+        <w:t xml:space="preserve"> for any non-zero vector </w:t>
+      </w:r>
+      <m:oMath>
+        <m:r>
+          <w:rPr>
+            <w:rFonts w:ascii="Cambria Math" w:eastAsiaTheme="minorEastAsia" w:hAnsi="Cambria Math"/>
+          </w:rPr>
+          <m:t>u</m:t>
+        </m:r>
+      </m:oMath>
+      <w:r>
+        <w:rPr>
+          <w:rFonts w:eastAsiaTheme="minorEastAsia"/>
+        </w:rPr>
+        <w:t xml:space="preserve"> </w:t>
+      </w:r>
+    </w:p>
+    <w:p/>
+    <w:p>
+      <w:pPr>
+        <w:rPr>
+          <w:rFonts w:eastAsiaTheme="minorEastAsia"/>
+        </w:rPr>
+      </w:pPr>
+      <w:r>
+        <w:t xml:space="preserve">In a local coordinate chart </w:t>
+      </w:r>
+      <m:oMath>
+        <m:d>
+          <m:dPr>
+            <m:ctrlPr>
+              <w:rPr>
+                <w:rFonts w:ascii="Cambria Math" w:hAnsi="Cambria Math"/>
+                <w:i/>
+              </w:rPr>
+            </m:ctrlPr>
+          </m:dPr>
+          <m:e>
+            <m:sSup>
+              <m:sSupPr>
+                <m:ctrlPr>
+                  <w:rPr>
+                    <w:rFonts w:ascii="Cambria Math" w:hAnsi="Cambria Math"/>
+                    <w:i/>
+                  </w:rPr>
+                </m:ctrlPr>
+              </m:sSupPr>
+              <m:e>
+                <m:r>
+                  <w:rPr>
+                    <w:rFonts w:ascii="Cambria Math" w:hAnsi="Cambria Math"/>
+                  </w:rPr>
+                  <m:t>x</m:t>
+                </m:r>
+              </m:e>
+              <m:sup>
+                <m:r>
+                  <w:rPr>
+                    <w:rFonts w:ascii="Cambria Math" w:hAnsi="Cambria Math"/>
+                  </w:rPr>
+                  <m:t>1</m:t>
+                </m:r>
+              </m:sup>
+            </m:sSup>
+            <m:r>
+              <w:rPr>
+                <w:rFonts w:ascii="Cambria Math" w:hAnsi="Cambria Math"/>
+              </w:rPr>
+              <m:t>,</m:t>
+            </m:r>
+            <m:sSup>
+              <m:sSupPr>
+                <m:ctrlPr>
+                  <w:rPr>
+                    <w:rFonts w:ascii="Cambria Math" w:hAnsi="Cambria Math"/>
+                    <w:i/>
+                  </w:rPr>
+                </m:ctrlPr>
+              </m:sSupPr>
+              <m:e>
+                <m:r>
+                  <w:rPr>
+                    <w:rFonts w:ascii="Cambria Math" w:hAnsi="Cambria Math"/>
+                  </w:rPr>
+                  <m:t>x</m:t>
+                </m:r>
+              </m:e>
+              <m:sup>
+                <m:r>
+                  <w:rPr>
+                    <w:rFonts w:ascii="Cambria Math" w:hAnsi="Cambria Math"/>
+                  </w:rPr>
+                  <m:t>2</m:t>
+                </m:r>
+              </m:sup>
+            </m:sSup>
+            <m:r>
+              <w:rPr>
+                <w:rFonts w:ascii="Cambria Math" w:hAnsi="Cambria Math"/>
+              </w:rPr>
+              <m:t>,…,</m:t>
+            </m:r>
+            <m:sSup>
+              <m:sSupPr>
+                <m:ctrlPr>
+                  <w:rPr>
+                    <w:rFonts w:ascii="Cambria Math" w:hAnsi="Cambria Math"/>
+                    <w:i/>
+                  </w:rPr>
+                </m:ctrlPr>
+              </m:sSupPr>
+              <m:e>
+                <m:r>
+                  <w:rPr>
+                    <w:rFonts w:ascii="Cambria Math" w:hAnsi="Cambria Math"/>
+                  </w:rPr>
+                  <m:t>x</m:t>
+                </m:r>
+              </m:e>
+              <m:sup>
+                <m:r>
+                  <w:rPr>
+                    <w:rFonts w:ascii="Cambria Math" w:hAnsi="Cambria Math"/>
+                  </w:rPr>
+                  <m:t>n</m:t>
+                </m:r>
+              </m:sup>
+            </m:sSup>
+          </m:e>
+        </m:d>
+      </m:oMath>
+      <w:r>
+        <w:rPr>
+          <w:rFonts w:eastAsiaTheme="minorEastAsia"/>
+        </w:rPr>
+        <w:t xml:space="preserve">, the metric tensor is expressed as a symmetric matrix </w:t>
+      </w:r>
+      <m:oMath>
+        <m:sSub>
+          <m:sSubPr>
+            <m:ctrlPr>
+              <w:rPr>
+                <w:rFonts w:ascii="Cambria Math" w:eastAsiaTheme="minorEastAsia" w:hAnsi="Cambria Math"/>
+                <w:i/>
+              </w:rPr>
+            </m:ctrlPr>
+          </m:sSubPr>
+          <m:e>
+            <m:r>
+              <w:rPr>
+                <w:rFonts w:ascii="Cambria Math" w:eastAsiaTheme="minorEastAsia" w:hAnsi="Cambria Math"/>
+              </w:rPr>
+              <m:t>g</m:t>
+            </m:r>
+          </m:e>
+          <m:sub>
+            <m:r>
+              <w:rPr>
+                <w:rFonts w:ascii="Cambria Math" w:eastAsiaTheme="minorEastAsia" w:hAnsi="Cambria Math"/>
+              </w:rPr>
+              <m:t>ij</m:t>
+            </m:r>
+          </m:sub>
+        </m:sSub>
+      </m:oMath>
+      <w:r>
+        <w:rPr>
+          <w:rFonts w:eastAsiaTheme="minorEastAsia"/>
+        </w:rPr>
+        <w:t>:</w:t>
+      </w:r>
+    </w:p>
+    <w:p>
+      <w:pPr>
+        <w:rPr>
+          <w:rFonts w:eastAsiaTheme="minorEastAsia"/>
+        </w:rPr>
+      </w:pPr>
+    </w:p>
+    <w:p>
+      <w:pPr>
+        <w:rPr>
+          <w:rFonts w:eastAsiaTheme="minorEastAsia"/>
+        </w:rPr>
+      </w:pPr>
+      <m:oMath>
+        <m:sSub>
+          <m:sSubPr>
+            <m:ctrlPr>
+              <w:rPr>
+                <w:rFonts w:ascii="Cambria Math" w:eastAsiaTheme="minorEastAsia" w:hAnsi="Cambria Math"/>
+                <w:i/>
+              </w:rPr>
+            </m:ctrlPr>
+          </m:sSubPr>
+          <m:e>
+            <m:r>
+              <w:rPr>
+                <w:rFonts w:ascii="Cambria Math" w:eastAsiaTheme="minorEastAsia" w:hAnsi="Cambria Math"/>
+              </w:rPr>
+              <m:t>g</m:t>
+            </m:r>
+          </m:e>
+          <m:sub>
+            <m:r>
+              <w:rPr>
+                <w:rFonts w:ascii="Cambria Math" w:eastAsiaTheme="minorEastAsia" w:hAnsi="Cambria Math"/>
+              </w:rPr>
+              <m:t>ij</m:t>
+            </m:r>
+          </m:sub>
+        </m:sSub>
+        <m:d>
+          <m:dPr>
+            <m:ctrlPr>
+              <w:rPr>
+                <w:rFonts w:ascii="Cambria Math" w:eastAsiaTheme="minorEastAsia" w:hAnsi="Cambria Math"/>
+                <w:i/>
+              </w:rPr>
+            </m:ctrlPr>
+          </m:dPr>
+          <m:e>
+            <m:r>
+              <w:rPr>
+                <w:rFonts w:ascii="Cambria Math" w:eastAsiaTheme="minorEastAsia" w:hAnsi="Cambria Math"/>
+              </w:rPr>
+              <m:t>x</m:t>
+            </m:r>
+          </m:e>
+        </m:d>
+        <m:r>
+          <w:rPr>
+            <w:rFonts w:ascii="Cambria Math" w:eastAsiaTheme="minorEastAsia" w:hAnsi="Cambria Math"/>
+          </w:rPr>
+          <m:t>=g</m:t>
+        </m:r>
+        <m:d>
+          <m:dPr>
+            <m:ctrlPr>
+              <w:rPr>
+                <w:rFonts w:ascii="Cambria Math" w:eastAsiaTheme="minorEastAsia" w:hAnsi="Cambria Math"/>
+                <w:i/>
+              </w:rPr>
+            </m:ctrlPr>
+          </m:dPr>
+          <m:e>
+            <m:f>
+              <m:fPr>
+                <m:ctrlPr>
+                  <w:rPr>
+                    <w:rFonts w:ascii="Cambria Math" w:eastAsiaTheme="minorEastAsia" w:hAnsi="Cambria Math"/>
+                    <w:i/>
+                  </w:rPr>
+                </m:ctrlPr>
+              </m:fPr>
+              <m:num>
+                <m:r>
+                  <w:rPr>
+                    <w:rFonts w:ascii="Cambria Math" w:eastAsiaTheme="minorEastAsia" w:hAnsi="Cambria Math"/>
+                  </w:rPr>
+                  <m:t>∂</m:t>
+                </m:r>
+              </m:num>
+              <m:den>
+                <m:r>
+                  <w:rPr>
+                    <w:rFonts w:ascii="Cambria Math" w:eastAsiaTheme="minorEastAsia" w:hAnsi="Cambria Math"/>
+                  </w:rPr>
+                  <m:t>∂</m:t>
+                </m:r>
+                <m:sSup>
+                  <m:sSupPr>
+                    <m:ctrlPr>
+                      <w:rPr>
+                        <w:rFonts w:ascii="Cambria Math" w:eastAsiaTheme="minorEastAsia" w:hAnsi="Cambria Math"/>
+                        <w:i/>
+                      </w:rPr>
+                    </m:ctrlPr>
+                  </m:sSupPr>
+                  <m:e>
+                    <m:r>
+                      <w:rPr>
+                        <w:rFonts w:ascii="Cambria Math" w:eastAsiaTheme="minorEastAsia" w:hAnsi="Cambria Math"/>
+                      </w:rPr>
+                      <m:t>x</m:t>
+                    </m:r>
+                  </m:e>
+                  <m:sup>
+                    <m:r>
+                      <w:rPr>
+                        <w:rFonts w:ascii="Cambria Math" w:eastAsiaTheme="minorEastAsia" w:hAnsi="Cambria Math"/>
+                      </w:rPr>
+                      <m:t>i</m:t>
+                    </m:r>
+                  </m:sup>
+                </m:sSup>
+              </m:den>
+            </m:f>
+            <m:r>
+              <w:rPr>
+                <w:rFonts w:ascii="Cambria Math" w:eastAsiaTheme="minorEastAsia" w:hAnsi="Cambria Math"/>
+              </w:rPr>
+              <m:t>,</m:t>
+            </m:r>
+            <m:f>
+              <m:fPr>
+                <m:ctrlPr>
+                  <w:rPr>
+                    <w:rFonts w:ascii="Cambria Math" w:eastAsiaTheme="minorEastAsia" w:hAnsi="Cambria Math"/>
+                    <w:i/>
+                  </w:rPr>
+                </m:ctrlPr>
+              </m:fPr>
+              <m:num>
+                <m:r>
+                  <w:rPr>
+                    <w:rFonts w:ascii="Cambria Math" w:eastAsiaTheme="minorEastAsia" w:hAnsi="Cambria Math"/>
+                  </w:rPr>
+                  <m:t>∂</m:t>
+                </m:r>
+              </m:num>
+              <m:den>
+                <m:r>
+                  <w:rPr>
+                    <w:rFonts w:ascii="Cambria Math" w:eastAsiaTheme="minorEastAsia" w:hAnsi="Cambria Math"/>
+                  </w:rPr>
+                  <m:t>∂</m:t>
+                </m:r>
+                <m:sSup>
+                  <m:sSupPr>
+                    <m:ctrlPr>
+                      <w:rPr>
+                        <w:rFonts w:ascii="Cambria Math" w:eastAsiaTheme="minorEastAsia" w:hAnsi="Cambria Math"/>
+                        <w:i/>
+                      </w:rPr>
+                    </m:ctrlPr>
+                  </m:sSupPr>
+                  <m:e>
+                    <m:r>
+                      <w:rPr>
+                        <w:rFonts w:ascii="Cambria Math" w:eastAsiaTheme="minorEastAsia" w:hAnsi="Cambria Math"/>
+                      </w:rPr>
+                      <m:t>x</m:t>
+                    </m:r>
+                  </m:e>
+                  <m:sup>
+                    <m:r>
+                      <w:rPr>
+                        <w:rFonts w:ascii="Cambria Math" w:eastAsiaTheme="minorEastAsia" w:hAnsi="Cambria Math"/>
+                      </w:rPr>
+                      <m:t>j</m:t>
+                    </m:r>
+                  </m:sup>
+                </m:sSup>
+              </m:den>
+            </m:f>
+          </m:e>
+        </m:d>
+      </m:oMath>
+      <w:r>
+        <w:rPr>
+          <w:rFonts w:eastAsiaTheme="minorEastAsia"/>
+        </w:rPr>
+        <w:t xml:space="preserve"> </w:t>
+      </w:r>
+    </w:p>
+    <w:p>
+      <w:pPr>
+        <w:rPr>
+          <w:rFonts w:eastAsiaTheme="minorEastAsia"/>
+        </w:rPr>
+      </w:pPr>
+    </w:p>
+    <w:p>
+      <w:pPr>
+        <w:rPr>
+          <w:rFonts w:eastAsiaTheme="minorEastAsia"/>
+        </w:rPr>
+      </w:pPr>
+      <w:r>
+        <w:rPr>
+          <w:rFonts w:eastAsiaTheme="minorEastAsia"/>
+        </w:rPr>
+        <w:t xml:space="preserve">The infinitesimal line element </w:t>
+      </w:r>
+      <m:oMath>
+        <m:sSup>
+          <m:sSupPr>
+            <m:ctrlPr>
+              <w:rPr>
+                <w:rFonts w:ascii="Cambria Math" w:eastAsiaTheme="minorEastAsia" w:hAnsi="Cambria Math"/>
+                <w:i/>
+              </w:rPr>
+            </m:ctrlPr>
+          </m:sSupPr>
+          <m:e>
+            <m:r>
+              <w:rPr>
+                <w:rFonts w:ascii="Cambria Math" w:eastAsiaTheme="minorEastAsia" w:hAnsi="Cambria Math"/>
+              </w:rPr>
+              <m:t>ds</m:t>
+            </m:r>
+          </m:e>
+          <m:sup>
+            <m:r>
+              <w:rPr>
+                <w:rFonts w:ascii="Cambria Math" w:eastAsiaTheme="minorEastAsia" w:hAnsi="Cambria Math"/>
+              </w:rPr>
+              <m:t>2</m:t>
+            </m:r>
+          </m:sup>
+        </m:sSup>
+      </m:oMath>
+      <w:r>
+        <w:rPr>
+          <w:rFonts w:eastAsiaTheme="minorEastAsia"/>
+        </w:rPr>
+        <w:t xml:space="preserve"> tracks how distance changes along any coordinate direction:</w:t>
+      </w:r>
+    </w:p>
+    <w:p>
+      <w:pPr>
+        <w:rPr>
+          <w:rFonts w:eastAsiaTheme="minorEastAsia"/>
+        </w:rPr>
+      </w:pPr>
+    </w:p>
+    <w:p>
+      <w:pPr>
+        <w:rPr>
+          <w:rFonts w:eastAsiaTheme="minorEastAsia"/>
+        </w:rPr>
+      </w:pPr>
+      <m:oMath>
+        <m:sSup>
+          <m:sSupPr>
+            <m:ctrlPr>
+              <w:rPr>
+                <w:rFonts w:ascii="Cambria Math" w:hAnsi="Cambria Math"/>
+                <w:i/>
+              </w:rPr>
+            </m:ctrlPr>
+          </m:sSupPr>
+          <m:e>
+            <m:r>
+              <w:rPr>
+                <w:rFonts w:ascii="Cambria Math" w:hAnsi="Cambria Math"/>
+              </w:rPr>
+              <m:t>ds</m:t>
+            </m:r>
+          </m:e>
+          <m:sup>
+            <m:r>
+              <w:rPr>
+                <w:rFonts w:ascii="Cambria Math" w:hAnsi="Cambria Math"/>
+              </w:rPr>
+              <m:t>2</m:t>
+            </m:r>
+          </m:sup>
+        </m:sSup>
+        <m:r>
+          <w:rPr>
+            <w:rFonts w:ascii="Cambria Math" w:hAnsi="Cambria Math"/>
+          </w:rPr>
+          <m:t>=</m:t>
+        </m:r>
+        <m:nary>
+          <m:naryPr>
+            <m:chr m:val="∑"/>
+            <m:limLoc m:val="undOvr"/>
+            <m:supHide m:val="1"/>
+            <m:ctrlPr>
+              <w:rPr>
+                <w:rFonts w:ascii="Cambria Math" w:hAnsi="Cambria Math"/>
+                <w:i/>
+              </w:rPr>
+            </m:ctrlPr>
+          </m:naryPr>
+          <m:sub>
+            <m:r>
+              <w:rPr>
+                <w:rFonts w:ascii="Cambria Math" w:hAnsi="Cambria Math"/>
+              </w:rPr>
+              <m:t>i,j</m:t>
+            </m:r>
+          </m:sub>
+          <m:sup/>
+          <m:e>
+            <m:sSub>
+              <m:sSubPr>
+                <m:ctrlPr>
+                  <w:rPr>
+                    <w:rFonts w:ascii="Cambria Math" w:hAnsi="Cambria Math"/>
+                    <w:i/>
+                  </w:rPr>
+                </m:ctrlPr>
+              </m:sSubPr>
+              <m:e>
+                <m:r>
+                  <w:rPr>
+                    <w:rFonts w:ascii="Cambria Math" w:hAnsi="Cambria Math"/>
+                  </w:rPr>
+                  <m:t>g</m:t>
+                </m:r>
+              </m:e>
+              <m:sub>
+                <m:r>
+                  <w:rPr>
+                    <w:rFonts w:ascii="Cambria Math" w:hAnsi="Cambria Math"/>
+                  </w:rPr>
+                  <m:t>ij</m:t>
+                </m:r>
+              </m:sub>
+            </m:sSub>
+            <m:sSup>
+              <m:sSupPr>
+                <m:ctrlPr>
+                  <w:rPr>
+                    <w:rFonts w:ascii="Cambria Math" w:hAnsi="Cambria Math"/>
+                    <w:i/>
+                  </w:rPr>
+                </m:ctrlPr>
+              </m:sSupPr>
+              <m:e>
+                <m:r>
+                  <w:rPr>
+                    <w:rFonts w:ascii="Cambria Math" w:hAnsi="Cambria Math"/>
+                  </w:rPr>
+                  <m:t>dx</m:t>
+                </m:r>
+              </m:e>
+              <m:sup>
+                <m:r>
+                  <w:rPr>
+                    <w:rFonts w:ascii="Cambria Math" w:hAnsi="Cambria Math"/>
+                  </w:rPr>
+                  <m:t>i</m:t>
+                </m:r>
+              </m:sup>
+            </m:sSup>
+            <m:sSup>
+              <m:sSupPr>
+                <m:ctrlPr>
+                  <w:rPr>
+                    <w:rFonts w:ascii="Cambria Math" w:hAnsi="Cambria Math"/>
+                    <w:i/>
+                  </w:rPr>
+                </m:ctrlPr>
+              </m:sSupPr>
+              <m:e>
+                <m:r>
+                  <w:rPr>
+                    <w:rFonts w:ascii="Cambria Math" w:hAnsi="Cambria Math"/>
+                  </w:rPr>
+                  <m:t>dx</m:t>
+                </m:r>
+              </m:e>
+              <m:sup>
+                <m:r>
+                  <w:rPr>
+                    <w:rFonts w:ascii="Cambria Math" w:hAnsi="Cambria Math"/>
+                  </w:rPr>
+                  <m:t>j</m:t>
+                </m:r>
+              </m:sup>
+            </m:sSup>
+          </m:e>
+        </m:nary>
+      </m:oMath>
+      <w:r>
+        <w:rPr>
+          <w:rFonts w:eastAsiaTheme="minorEastAsia"/>
+        </w:rPr>
+        <w:t xml:space="preserve"> </w:t>
+      </w:r>
+    </w:p>
+    <w:p>
+      <w:pPr>
+        <w:rPr>
+          <w:rFonts w:eastAsiaTheme="minorEastAsia"/>
+        </w:rPr>
+      </w:pPr>
+    </w:p>
+    <w:p>
+      <w:pPr>
+        <w:rPr>
+          <w:rFonts w:eastAsiaTheme="minorEastAsia"/>
+          <w:u w:val="single"/>
+        </w:rPr>
+      </w:pPr>
+      <w:r>
+        <w:rPr>
+          <w:rFonts w:eastAsiaTheme="minorEastAsia"/>
+          <w:u w:val="single"/>
+        </w:rPr>
+        <w:t>What the Metric Induces?</w:t>
+      </w:r>
+    </w:p>
+    <w:p/>
+    <w:p>
+      <w:pPr>
+        <w:rPr>
+          <w:b/>
+          <w:bCs/>
+        </w:rPr>
+      </w:pPr>
+      <w:r>
+        <w:rPr>
+          <w:b/>
+          <w:bCs/>
+        </w:rPr>
+        <w:t xml:space="preserve"> </w:t>
+      </w:r>
+      <w:r>
+        <w:rPr>
+          <w:b/>
+          <w:bCs/>
+        </w:rPr>
+        <w:t>Vector Norms and Angles</w:t>
+      </w:r>
+    </w:p>
+    <w:p>
+      <w:pPr>
+        <w:rPr>
+          <w:rFonts w:eastAsiaTheme="minorEastAsia"/>
+        </w:rPr>
+      </w:pPr>
+      <w:r>
+        <w:t xml:space="preserve">The length of a vector </w:t>
+      </w:r>
+      <m:oMath>
+        <m:r>
+          <w:rPr>
+            <w:rFonts w:ascii="Cambria Math" w:hAnsi="Cambria Math"/>
+          </w:rPr>
+          <m:t>u</m:t>
+        </m:r>
+      </m:oMath>
+      <w:r>
+        <w:t xml:space="preserve"> Is given by </w:t>
+      </w:r>
+      <m:oMath>
+        <m:d>
+          <m:dPr>
+            <m:begChr m:val="‖"/>
+            <m:endChr m:val="‖"/>
+            <m:ctrlPr>
+              <w:rPr>
+                <w:rFonts w:ascii="Cambria Math" w:hAnsi="Cambria Math"/>
+                <w:i/>
+              </w:rPr>
+            </m:ctrlPr>
+          </m:dPr>
+          <m:e>
+            <m:r>
+              <w:rPr>
+                <w:rFonts w:ascii="Cambria Math" w:hAnsi="Cambria Math"/>
+              </w:rPr>
+              <m:t>u</m:t>
+            </m:r>
+          </m:e>
+        </m:d>
+        <m:r>
+          <w:rPr>
+            <w:rFonts w:ascii="Cambria Math" w:eastAsiaTheme="minorEastAsia" w:hAnsi="Cambria Math"/>
+          </w:rPr>
+          <m:t>=</m:t>
+        </m:r>
+        <m:rad>
+          <m:radPr>
+            <m:degHide m:val="1"/>
+            <m:ctrlPr>
+              <w:rPr>
+                <w:rFonts w:ascii="Cambria Math" w:eastAsiaTheme="minorEastAsia" w:hAnsi="Cambria Math"/>
+                <w:i/>
+              </w:rPr>
+            </m:ctrlPr>
+          </m:radPr>
+          <m:deg/>
+          <m:e>
+            <m:sSub>
+              <m:sSubPr>
+                <m:ctrlPr>
+                  <w:rPr>
+                    <w:rFonts w:ascii="Cambria Math" w:eastAsiaTheme="minorEastAsia" w:hAnsi="Cambria Math"/>
+                    <w:i/>
+                  </w:rPr>
+                </m:ctrlPr>
+              </m:sSubPr>
+              <m:e>
+                <m:r>
+                  <w:rPr>
+                    <w:rFonts w:ascii="Cambria Math" w:eastAsiaTheme="minorEastAsia" w:hAnsi="Cambria Math"/>
+                  </w:rPr>
+                  <m:t>g</m:t>
+                </m:r>
+              </m:e>
+              <m:sub>
+                <m:r>
+                  <w:rPr>
+                    <w:rFonts w:ascii="Cambria Math" w:eastAsiaTheme="minorEastAsia" w:hAnsi="Cambria Math"/>
+                  </w:rPr>
+                  <m:t>p</m:t>
+                </m:r>
+              </m:sub>
+            </m:sSub>
+            <m:d>
+              <m:dPr>
+                <m:ctrlPr>
+                  <w:rPr>
+                    <w:rFonts w:ascii="Cambria Math" w:eastAsiaTheme="minorEastAsia" w:hAnsi="Cambria Math"/>
+                    <w:i/>
+                  </w:rPr>
+                </m:ctrlPr>
+              </m:dPr>
+              <m:e>
+                <m:r>
+                  <w:rPr>
+                    <w:rFonts w:ascii="Cambria Math" w:eastAsiaTheme="minorEastAsia" w:hAnsi="Cambria Math"/>
+                  </w:rPr>
+                  <m:t>u,u</m:t>
+                </m:r>
+              </m:e>
+            </m:d>
+          </m:e>
+        </m:rad>
+      </m:oMath>
+      <w:r>
+        <w:rPr>
+          <w:rFonts w:eastAsiaTheme="minorEastAsia"/>
+        </w:rPr>
+        <w:t xml:space="preserve"> and the angle </w:t>
+      </w:r>
+      <m:oMath>
+        <m:r>
+          <w:rPr>
+            <w:rFonts w:ascii="Cambria Math" w:eastAsiaTheme="minorEastAsia" w:hAnsi="Cambria Math"/>
+          </w:rPr>
+          <m:t>θ</m:t>
+        </m:r>
+      </m:oMath>
+      <w:r>
+        <w:rPr>
+          <w:rFonts w:eastAsiaTheme="minorEastAsia"/>
+        </w:rPr>
+        <w:t xml:space="preserve"> between two vectors </w:t>
+      </w:r>
+      <m:oMath>
+        <m:r>
+          <w:rPr>
+            <w:rFonts w:ascii="Cambria Math" w:eastAsiaTheme="minorEastAsia" w:hAnsi="Cambria Math"/>
+          </w:rPr>
+          <m:t>u</m:t>
+        </m:r>
+      </m:oMath>
+      <w:r>
+        <w:rPr>
+          <w:rFonts w:eastAsiaTheme="minorEastAsia"/>
+        </w:rPr>
+        <w:t xml:space="preserve"> and </w:t>
+      </w:r>
+      <m:oMath>
+        <m:r>
+          <w:rPr>
+            <w:rFonts w:ascii="Cambria Math" w:eastAsiaTheme="minorEastAsia" w:hAnsi="Cambria Math"/>
+          </w:rPr>
+          <m:t>v</m:t>
+        </m:r>
+      </m:oMath>
+      <w:r>
+        <w:rPr>
+          <w:rFonts w:eastAsiaTheme="minorEastAsia"/>
+        </w:rPr>
+        <w:t xml:space="preserve"> is found via </w:t>
+      </w:r>
+      <m:oMath>
+        <m:func>
+          <m:funcPr>
+            <m:ctrlPr>
+              <w:rPr>
+                <w:rFonts w:ascii="Cambria Math" w:eastAsiaTheme="minorEastAsia" w:hAnsi="Cambria Math"/>
+                <w:i/>
+              </w:rPr>
+            </m:ctrlPr>
+          </m:funcPr>
+          <m:fName>
+            <m:r>
+              <m:rPr>
+                <m:sty m:val="p"/>
+              </m:rPr>
+              <w:rPr>
+                <w:rFonts w:ascii="Cambria Math" w:eastAsiaTheme="minorEastAsia" w:hAnsi="Cambria Math"/>
+              </w:rPr>
+              <m:t>cos</m:t>
+            </m:r>
+          </m:fName>
+          <m:e>
+            <m:r>
+              <w:rPr>
+                <w:rFonts w:ascii="Cambria Math" w:eastAsiaTheme="minorEastAsia" w:hAnsi="Cambria Math"/>
+              </w:rPr>
+              <m:t>θ</m:t>
+            </m:r>
+          </m:e>
+        </m:func>
+        <m:r>
+          <w:rPr>
+            <w:rFonts w:ascii="Cambria Math" w:eastAsiaTheme="minorEastAsia" w:hAnsi="Cambria Math"/>
+          </w:rPr>
+          <m:t>=</m:t>
+        </m:r>
+        <m:f>
+          <m:fPr>
+            <m:ctrlPr>
+              <w:rPr>
+                <w:rFonts w:ascii="Cambria Math" w:eastAsiaTheme="minorEastAsia" w:hAnsi="Cambria Math"/>
+                <w:i/>
+              </w:rPr>
+            </m:ctrlPr>
+          </m:fPr>
+          <m:num>
+            <m:sSub>
+              <m:sSubPr>
+                <m:ctrlPr>
+                  <w:rPr>
+                    <w:rFonts w:ascii="Cambria Math" w:eastAsiaTheme="minorEastAsia" w:hAnsi="Cambria Math"/>
+                    <w:i/>
+                  </w:rPr>
+                </m:ctrlPr>
+              </m:sSubPr>
+              <m:e>
+                <m:r>
+                  <w:rPr>
+                    <w:rFonts w:ascii="Cambria Math" w:eastAsiaTheme="minorEastAsia" w:hAnsi="Cambria Math"/>
+                  </w:rPr>
+                  <m:t>g</m:t>
+                </m:r>
+              </m:e>
+              <m:sub>
+                <m:r>
+                  <w:rPr>
+                    <w:rFonts w:ascii="Cambria Math" w:eastAsiaTheme="minorEastAsia" w:hAnsi="Cambria Math"/>
+                  </w:rPr>
+                  <m:t>p</m:t>
+                </m:r>
+              </m:sub>
+            </m:sSub>
+            <m:d>
+              <m:dPr>
+                <m:ctrlPr>
+                  <w:rPr>
+                    <w:rFonts w:ascii="Cambria Math" w:eastAsiaTheme="minorEastAsia" w:hAnsi="Cambria Math"/>
+                    <w:i/>
+                  </w:rPr>
+                </m:ctrlPr>
+              </m:dPr>
+              <m:e>
+                <m:r>
+                  <w:rPr>
+                    <w:rFonts w:ascii="Cambria Math" w:eastAsiaTheme="minorEastAsia" w:hAnsi="Cambria Math"/>
+                  </w:rPr>
+                  <m:t>u,</m:t>
+                </m:r>
+                <m:r>
+                  <w:rPr>
+                    <w:rFonts w:ascii="Cambria Math" w:eastAsiaTheme="minorEastAsia" w:hAnsi="Cambria Math"/>
+                  </w:rPr>
+                  <m:t>v</m:t>
+                </m:r>
+              </m:e>
+            </m:d>
+          </m:num>
+          <m:den>
+            <m:d>
+              <m:dPr>
+                <m:begChr m:val="‖"/>
+                <m:endChr m:val="‖"/>
+                <m:ctrlPr>
+                  <w:rPr>
+                    <w:rFonts w:ascii="Cambria Math" w:eastAsiaTheme="minorEastAsia" w:hAnsi="Cambria Math"/>
+                    <w:i/>
+                  </w:rPr>
+                </m:ctrlPr>
+              </m:dPr>
+              <m:e>
+                <m:r>
+                  <w:rPr>
+                    <w:rFonts w:ascii="Cambria Math" w:eastAsiaTheme="minorEastAsia" w:hAnsi="Cambria Math"/>
+                  </w:rPr>
+                  <m:t>u</m:t>
+                </m:r>
+              </m:e>
+            </m:d>
+            <m:r>
+              <w:rPr>
+                <w:rFonts w:ascii="Cambria Math" w:eastAsiaTheme="minorEastAsia" w:hAnsi="Cambria Math"/>
+              </w:rPr>
+              <m:t>∙</m:t>
+            </m:r>
+            <m:d>
+              <m:dPr>
+                <m:begChr m:val="‖"/>
+                <m:endChr m:val="‖"/>
+                <m:ctrlPr>
+                  <w:rPr>
+                    <w:rFonts w:ascii="Cambria Math" w:eastAsiaTheme="minorEastAsia" w:hAnsi="Cambria Math"/>
+                    <w:i/>
+                  </w:rPr>
+                </m:ctrlPr>
+              </m:dPr>
+              <m:e>
+                <m:r>
+                  <w:rPr>
+                    <w:rFonts w:ascii="Cambria Math" w:eastAsiaTheme="minorEastAsia" w:hAnsi="Cambria Math"/>
+                  </w:rPr>
+                  <m:t>v</m:t>
+                </m:r>
+              </m:e>
+            </m:d>
+          </m:den>
+        </m:f>
+      </m:oMath>
+      <w:r>
+        <w:rPr>
+          <w:rFonts w:eastAsiaTheme="minorEastAsia"/>
+        </w:rPr>
+        <w:t>.</w:t>
+      </w:r>
+    </w:p>
+    <w:p>
+      <w:pPr>
+        <w:rPr>
+          <w:rFonts w:eastAsiaTheme="minorEastAsia"/>
+        </w:rPr>
+      </w:pPr>
+    </w:p>
+    <w:p>
+      <w:pPr>
+        <w:rPr>
+          <w:rFonts w:eastAsiaTheme="minorEastAsia"/>
+          <w:b/>
+          <w:bCs/>
+        </w:rPr>
+      </w:pPr>
+      <w:r>
+        <w:rPr>
+          <w:rFonts w:eastAsiaTheme="minorEastAsia"/>
+          <w:b/>
+          <w:bCs/>
+        </w:rPr>
+        <w:t>Arc Length of Curves</w:t>
+      </w:r>
+    </w:p>
+    <w:p>
+      <w:pPr>
+        <w:rPr>
+          <w:rFonts w:eastAsiaTheme="minorEastAsia"/>
+        </w:rPr>
+      </w:pPr>
+      <w:r>
+        <w:t xml:space="preserve">The length </w:t>
+      </w:r>
+      <m:oMath>
+        <m:r>
+          <w:rPr>
+            <w:rFonts w:ascii="Cambria Math" w:hAnsi="Cambria Math"/>
+          </w:rPr>
+          <m:t>L</m:t>
+        </m:r>
+      </m:oMath>
+      <w:r>
+        <w:t xml:space="preserve"> of a smooth curve </w:t>
+      </w:r>
+      <m:oMath>
+        <m:r>
+          <w:rPr>
+            <w:rFonts w:ascii="Cambria Math" w:hAnsi="Cambria Math"/>
+          </w:rPr>
+          <m:t>γ</m:t>
+        </m:r>
+        <m:d>
+          <m:dPr>
+            <m:ctrlPr>
+              <w:rPr>
+                <w:rFonts w:ascii="Cambria Math" w:hAnsi="Cambria Math"/>
+                <w:i/>
+              </w:rPr>
+            </m:ctrlPr>
+          </m:dPr>
+          <m:e>
+            <m:r>
+              <w:rPr>
+                <w:rFonts w:ascii="Cambria Math" w:hAnsi="Cambria Math"/>
+              </w:rPr>
+              <m:t>t</m:t>
+            </m:r>
+          </m:e>
+        </m:d>
+      </m:oMath>
+      <w:r>
+        <w:rPr>
+          <w:rFonts w:eastAsiaTheme="minorEastAsia"/>
+        </w:rPr>
+        <w:t xml:space="preserve"> for </w:t>
+      </w:r>
+      <m:oMath>
+        <m:r>
+          <w:rPr>
+            <w:rFonts w:ascii="Cambria Math" w:eastAsiaTheme="minorEastAsia" w:hAnsi="Cambria Math"/>
+          </w:rPr>
+          <m:t>t</m:t>
+        </m:r>
+        <m:r>
+          <w:rPr>
+            <w:rFonts w:ascii="Cambria Math" w:eastAsiaTheme="minorEastAsia" w:hAnsi="Cambria Math"/>
+          </w:rPr>
+          <m:t>∈</m:t>
+        </m:r>
+        <m:d>
+          <m:dPr>
+            <m:begChr m:val="["/>
+            <m:endChr m:val="]"/>
+            <m:ctrlPr>
+              <w:rPr>
+                <w:rFonts w:ascii="Cambria Math" w:eastAsiaTheme="minorEastAsia" w:hAnsi="Cambria Math"/>
+                <w:i/>
+              </w:rPr>
+            </m:ctrlPr>
+          </m:dPr>
+          <m:e>
+            <m:r>
+              <w:rPr>
+                <w:rFonts w:ascii="Cambria Math" w:eastAsiaTheme="minorEastAsia" w:hAnsi="Cambria Math"/>
+              </w:rPr>
+              <m:t>a,b</m:t>
+            </m:r>
+          </m:e>
+        </m:d>
+      </m:oMath>
+      <w:r>
+        <w:rPr>
+          <w:rFonts w:eastAsiaTheme="minorEastAsia"/>
+        </w:rPr>
+        <w:t xml:space="preserve"> is computed by integrating its speed:</w:t>
+      </w:r>
+    </w:p>
+    <w:p>
+      <w:pPr>
+        <w:rPr>
+          <w:rFonts w:eastAsiaTheme="minorEastAsia"/>
+        </w:rPr>
+      </w:pPr>
+    </w:p>
+    <w:p>
+      <w:pPr>
+        <w:rPr>
+          <w:rFonts w:eastAsiaTheme="minorEastAsia"/>
+        </w:rPr>
+      </w:pPr>
+      <w:r>
+        <w:rPr>
+          <w:rFonts w:eastAsiaTheme="minorEastAsia"/>
+        </w:rPr>
+        <w:t>L</w:t>
+      </w:r>
+    </w:p>
+    <w:p>
+      <w:pPr>
+        <w:rPr>
+          <w:rFonts w:eastAsiaTheme="minorEastAsia"/>
+        </w:rPr>
+      </w:pPr>
+    </w:p>
+    <w:p>
+      <w:pPr>
+        <w:rPr>
+          <w:rFonts w:eastAsiaTheme="minorEastAsia"/>
+        </w:rPr>
+      </w:pPr>
+    </w:p>
+    <w:p>
+      <w:pPr>
+        <w:pStyle w:val="Heading2"/>
+        <w:rPr>
+          <w:rFonts w:eastAsiaTheme="minorEastAsia"/>
+        </w:rPr>
+      </w:pPr>
+      <w:r>
+        <w:rPr>
+          <w:rFonts w:eastAsiaTheme="minorEastAsia"/>
+        </w:rPr>
+        <w:t>More on Topological Spaces</w:t>
+      </w:r>
+    </w:p>
+    <w:p/>
+    <w:p>
+      <w:r>
+        <w:rPr>
+          <w:b/>
+          <w:bCs/>
+        </w:rPr>
+        <w:t>Definition</w:t>
+      </w:r>
+      <w:r>
+        <w:t xml:space="preserve"> </w:t>
+      </w:r>
+      <w:r>
+        <w:rPr>
+          <w:i/>
+          <w:iCs/>
+        </w:rPr>
+        <w:t>second-counta</w:t>
+      </w:r>
+      <w:r>
+        <w:rPr>
+          <w:i/>
+          <w:iCs/>
+        </w:rPr>
+        <w:t>ble</w:t>
+      </w:r>
+    </w:p>
+    <w:p>
+      <w:pPr>
+        <w:rPr>
+          <w:rFonts w:eastAsiaTheme="minorEastAsia"/>
+        </w:rPr>
+      </w:pPr>
+      <w:r>
+        <w:t xml:space="preserve">There exists a countable collection of open sets </w:t>
+      </w:r>
+      <m:oMath>
+        <m:r>
+          <m:rPr>
+            <m:scr m:val="script"/>
+          </m:rPr>
+          <w:rPr>
+            <w:rFonts w:ascii="Cambria Math" w:hAnsi="Cambria Math"/>
+          </w:rPr>
+          <m:t>B=</m:t>
+        </m:r>
+        <m:d>
+          <m:dPr>
+            <m:begChr m:val="{"/>
+            <m:endChr m:val="}"/>
+            <m:ctrlPr>
+              <w:rPr>
+                <w:rFonts w:ascii="Cambria Math" w:hAnsi="Cambria Math"/>
+                <w:i/>
+              </w:rPr>
+            </m:ctrlPr>
+          </m:dPr>
+          <m:e>
+            <m:sSub>
+              <m:sSubPr>
+                <m:ctrlPr>
+                  <w:rPr>
+                    <w:rFonts w:ascii="Cambria Math" w:hAnsi="Cambria Math"/>
+                    <w:i/>
+                  </w:rPr>
+                </m:ctrlPr>
+              </m:sSubPr>
+              <m:e>
+                <m:r>
+                  <w:rPr>
+                    <w:rFonts w:ascii="Cambria Math" w:hAnsi="Cambria Math"/>
+                  </w:rPr>
+                  <m:t>U</m:t>
+                </m:r>
+              </m:e>
+              <m:sub>
+                <m:r>
+                  <w:rPr>
+                    <w:rFonts w:ascii="Cambria Math" w:hAnsi="Cambria Math"/>
+                  </w:rPr>
+                  <m:t>1</m:t>
+                </m:r>
+              </m:sub>
+            </m:sSub>
+            <m:r>
+              <w:rPr>
+                <w:rFonts w:ascii="Cambria Math" w:hAnsi="Cambria Math"/>
+              </w:rPr>
+              <m:t>,</m:t>
+            </m:r>
+            <m:sSub>
+              <m:sSubPr>
+                <m:ctrlPr>
+                  <w:rPr>
+                    <w:rFonts w:ascii="Cambria Math" w:hAnsi="Cambria Math"/>
+                    <w:i/>
+                  </w:rPr>
+                </m:ctrlPr>
+              </m:sSubPr>
+              <m:e>
+                <m:r>
+                  <w:rPr>
+                    <w:rFonts w:ascii="Cambria Math" w:hAnsi="Cambria Math"/>
+                  </w:rPr>
+                  <m:t>U</m:t>
+                </m:r>
+              </m:e>
+              <m:sub>
+                <m:r>
+                  <w:rPr>
+                    <w:rFonts w:ascii="Cambria Math" w:hAnsi="Cambria Math"/>
+                  </w:rPr>
+                  <m:t>2</m:t>
+                </m:r>
+              </m:sub>
+            </m:sSub>
+            <m:r>
+              <w:rPr>
+                <w:rFonts w:ascii="Cambria Math" w:hAnsi="Cambria Math"/>
+              </w:rPr>
+              <m:t>,</m:t>
+            </m:r>
+            <m:sSub>
+              <m:sSubPr>
+                <m:ctrlPr>
+                  <w:rPr>
+                    <w:rFonts w:ascii="Cambria Math" w:hAnsi="Cambria Math"/>
+                    <w:i/>
+                  </w:rPr>
+                </m:ctrlPr>
+              </m:sSubPr>
+              <m:e>
+                <m:r>
+                  <w:rPr>
+                    <w:rFonts w:ascii="Cambria Math" w:hAnsi="Cambria Math"/>
+                  </w:rPr>
+                  <m:t>U</m:t>
+                </m:r>
+              </m:e>
+              <m:sub>
+                <m:r>
+                  <w:rPr>
+                    <w:rFonts w:ascii="Cambria Math" w:hAnsi="Cambria Math"/>
+                  </w:rPr>
+                  <m:t>3</m:t>
+                </m:r>
+              </m:sub>
+            </m:sSub>
+            <m:r>
+              <w:rPr>
+                <w:rFonts w:ascii="Cambria Math" w:hAnsi="Cambria Math"/>
+              </w:rPr>
+              <m:t>,…</m:t>
+            </m:r>
+          </m:e>
+        </m:d>
+      </m:oMath>
+      <w:r>
+        <w:rPr>
+          <w:rFonts w:eastAsiaTheme="minorEastAsia"/>
+        </w:rPr>
+        <w:t xml:space="preserve"> such that every open set in the space can be written as a union of elements from </w:t>
+      </w:r>
+      <m:oMath>
+        <m:r>
+          <m:rPr>
+            <m:scr m:val="script"/>
+          </m:rPr>
+          <w:rPr>
+            <w:rFonts w:ascii="Cambria Math" w:hAnsi="Cambria Math"/>
+          </w:rPr>
+          <m:t>B</m:t>
+        </m:r>
+      </m:oMath>
+      <w:r>
+        <w:rPr>
+          <w:rFonts w:eastAsiaTheme="minorEastAsia"/>
+        </w:rPr>
+        <w:t>.</w:t>
+      </w:r>
+    </w:p>
+    <w:p>
+      <w:pPr>
+        <w:rPr>
+          <w:rFonts w:eastAsiaTheme="minorEastAsia"/>
+        </w:rPr>
+      </w:pPr>
+    </w:p>
+    <w:p>
+      <w:pPr>
+        <w:rPr>
+          <w:rFonts w:eastAsiaTheme="minorEastAsia"/>
+        </w:rPr>
+      </w:pPr>
+      <w:r>
+        <w:rPr>
+          <w:rFonts w:eastAsiaTheme="minorEastAsia"/>
+          <w:b/>
+          <w:bCs/>
+        </w:rPr>
+        <w:t>Definition</w:t>
+      </w:r>
+      <w:r>
+        <w:rPr>
+          <w:rFonts w:eastAsiaTheme="minorEastAsia"/>
+        </w:rPr>
+        <w:t xml:space="preserve"> </w:t>
+      </w:r>
+      <w:r>
+        <w:rPr>
+          <w:rFonts w:eastAsiaTheme="minorEastAsia"/>
+          <w:i/>
+          <w:iCs/>
+        </w:rPr>
+        <w:t>Hausdorff</w:t>
+      </w:r>
+      <w:r>
+        <w:rPr>
+          <w:rFonts w:eastAsiaTheme="minorEastAsia"/>
+        </w:rPr>
+        <w:t xml:space="preserve"> (</w:t>
+      </w:r>
+      <m:oMath>
+        <m:sSub>
+          <m:sSubPr>
+            <m:ctrlPr>
+              <w:rPr>
+                <w:rFonts w:ascii="Cambria Math" w:eastAsiaTheme="minorEastAsia" w:hAnsi="Cambria Math"/>
+                <w:i/>
+              </w:rPr>
+            </m:ctrlPr>
+          </m:sSubPr>
+          <m:e>
+            <m:r>
+              <w:rPr>
+                <w:rFonts w:ascii="Cambria Math" w:eastAsiaTheme="minorEastAsia" w:hAnsi="Cambria Math"/>
+              </w:rPr>
+              <m:t>T</m:t>
+            </m:r>
+          </m:e>
+          <m:sub>
+            <m:r>
+              <w:rPr>
+                <w:rFonts w:ascii="Cambria Math" w:eastAsiaTheme="minorEastAsia" w:hAnsi="Cambria Math"/>
+              </w:rPr>
+              <m:t>2</m:t>
+            </m:r>
+          </m:sub>
+        </m:sSub>
+      </m:oMath>
+      <w:r>
+        <w:rPr>
+          <w:rFonts w:eastAsiaTheme="minorEastAsia"/>
+        </w:rPr>
+        <w:t>)</w:t>
+      </w:r>
+    </w:p>
+    <w:p/>
+    <w:p/>
+    <w:p>
+      <w:r>
+        <w:rPr>
+          <w:b/>
+          <w:bCs/>
+        </w:rPr>
+        <w:t>Definition</w:t>
+      </w:r>
+      <w:r>
+        <w:t xml:space="preserve"> </w:t>
+      </w:r>
+      <w:r>
+        <w:rPr>
+          <w:i/>
+          <w:iCs/>
+        </w:rPr>
+        <w:t>second-countable Hausdorff space</w:t>
+      </w:r>
+    </w:p>
+    <w:p>
+      <w:r>
+        <w:t>A</w:t>
+      </w:r>
+      <w:r>
+        <w:t xml:space="preserve"> topological space that has a countable base for its topology (second-countable) and in which distinct points can be separated by disjoint open sets (Hausdorff). </w:t>
+      </w:r>
+    </w:p>
     <w:p/>
     <w:sectPr>
       <w:pgSz w:w="12240" w:h="15840"/>
@@ -277,8 +2865,129 @@
 </w:document>
 </file>
 
+<file path=word/numbering.xml><?xml version="1.0" encoding="utf-8"?>
+<w:numbering xmlns:wpc="http://schemas.microsoft.com/office/word/2010/wordprocessingCanvas" xmlns:cx="http://schemas.microsoft.com/office/drawing/2014/chartex" xmlns:cx1="http://schemas.microsoft.com/office/drawing/2015/9/8/chartex" xmlns:cx2="http://schemas.microsoft.com/office/drawing/2015/10/21/chartex" xmlns:cx3="http://schemas.microsoft.com/office/drawing/2016/5/9/chartex" xmlns:cx4="http://schemas.microsoft.com/office/drawing/2016/5/10/chartex" xmlns:cx5="http://schemas.microsoft.com/office/drawing/2016/5/11/chartex" xmlns:cx6="http://schemas.microsoft.com/office/drawing/2016/5/12/chartex" xmlns:cx7="http://schemas.microsoft.com/office/drawing/2016/5/13/chartex" xmlns:cx8="http://schemas.microsoft.com/office/drawing/2016/5/14/chartex" xmlns:mc="http://schemas.openxmlformats.org/markup-compatibility/2006" xmlns:aink="http://schemas.microsoft.com/office/drawing/2016/ink" xmlns:am3d="http://schemas.microsoft.com/office/drawing/2017/model3d" xmlns:o="urn:schemas-microsoft-com:office:office" xmlns:oel="http://schemas.microsoft.com/office/2019/extlst" xmlns:r="http://schemas.openxmlformats.org/officeDocument/2006/relationships" xmlns:m="http://schemas.openxmlformats.org/officeDocument/2006/math" xmlns:v="urn:schemas-microsoft-com:vml" xmlns:wp14="http://schemas.microsoft.com/office/word/2010/wordprocessingDrawing" xmlns:wp="http://schemas.openxmlformats.org/drawingml/2006/wordprocessingDrawing" xmlns:w10="urn:schemas-microsoft-com:office:word" xmlns:w="http://schemas.openxmlformats.org/wordprocessingml/2006/main" xmlns:w14="http://schemas.microsoft.com/office/word/2010/wordml" xmlns:w15="http://schemas.microsoft.com/office/word/2012/wordml" xmlns:w16cex="http://schemas.microsoft.com/office/word/2018/wordml/cex" xmlns:w16cid="http://schemas.microsoft.com/office/word/2016/wordml/cid" xmlns:w16="http://schemas.microsoft.com/office/word/2018/wordml" xmlns:w16sdtdh="http://schemas.microsoft.com/office/word/2020/wordml/sdtdatahash" xmlns:w16se="http://schemas.microsoft.com/office/word/2015/wordml/symex" xmlns:wpg="http://schemas.microsoft.com/office/word/2010/wordprocessingGroup" xmlns:wpi="http://schemas.microsoft.com/office/word/2010/wordprocessingInk" xmlns:wne="http://schemas.microsoft.com/office/word/2006/wordml" xmlns:wps="http://schemas.microsoft.com/office/word/2010/wordprocessingShape" mc:Ignorable="w14 w15 w16se w16cid w16 w16cex w16sdtdh wp14">
+  <w:abstractNum w:abstractNumId="0" w15:restartNumberingAfterBreak="0">
+    <w:nsid w:val="4C0E6C4F"/>
+    <w:multiLevelType w:val="hybridMultilevel"/>
+    <w:tmpl w:val="9B6C1EDE"/>
+    <w:lvl w:ilvl="0" w:tplc="340279D6">
+      <w:start w:val="2"/>
+      <w:numFmt w:val="bullet"/>
+      <w:lvlText w:val=""/>
+      <w:lvlJc w:val="left"/>
+      <w:pPr>
+        <w:ind w:left="720" w:hanging="360"/>
+      </w:pPr>
+      <w:rPr>
+        <w:rFonts w:ascii="Symbol" w:eastAsiaTheme="minorEastAsia" w:hAnsi="Symbol" w:cstheme="minorBidi" w:hint="default"/>
+      </w:rPr>
+    </w:lvl>
+    <w:lvl w:ilvl="1" w:tplc="04090003" w:tentative="1">
+      <w:start w:val="1"/>
+      <w:numFmt w:val="bullet"/>
+      <w:lvlText w:val="o"/>
+      <w:lvlJc w:val="left"/>
+      <w:pPr>
+        <w:ind w:left="1440" w:hanging="360"/>
+      </w:pPr>
+      <w:rPr>
+        <w:rFonts w:ascii="Courier New" w:hAnsi="Courier New" w:cs="Courier New" w:hint="default"/>
+      </w:rPr>
+    </w:lvl>
+    <w:lvl w:ilvl="2" w:tplc="04090005" w:tentative="1">
+      <w:start w:val="1"/>
+      <w:numFmt w:val="bullet"/>
+      <w:lvlText w:val=""/>
+      <w:lvlJc w:val="left"/>
+      <w:pPr>
+        <w:ind w:left="2160" w:hanging="360"/>
+      </w:pPr>
+      <w:rPr>
+        <w:rFonts w:ascii="Wingdings" w:hAnsi="Wingdings" w:hint="default"/>
+      </w:rPr>
+    </w:lvl>
+    <w:lvl w:ilvl="3" w:tplc="04090001" w:tentative="1">
+      <w:start w:val="1"/>
+      <w:numFmt w:val="bullet"/>
+      <w:lvlText w:val=""/>
+      <w:lvlJc w:val="left"/>
+      <w:pPr>
+        <w:ind w:left="2880" w:hanging="360"/>
+      </w:pPr>
+      <w:rPr>
+        <w:rFonts w:ascii="Symbol" w:hAnsi="Symbol" w:hint="default"/>
+      </w:rPr>
+    </w:lvl>
+    <w:lvl w:ilvl="4" w:tplc="04090003" w:tentative="1">
+      <w:start w:val="1"/>
+      <w:numFmt w:val="bullet"/>
+      <w:lvlText w:val="o"/>
+      <w:lvlJc w:val="left"/>
+      <w:pPr>
+        <w:ind w:left="3600" w:hanging="360"/>
+      </w:pPr>
+      <w:rPr>
+        <w:rFonts w:ascii="Courier New" w:hAnsi="Courier New" w:cs="Courier New" w:hint="default"/>
+      </w:rPr>
+    </w:lvl>
+    <w:lvl w:ilvl="5" w:tplc="04090005" w:tentative="1">
+      <w:start w:val="1"/>
+      <w:numFmt w:val="bullet"/>
+      <w:lvlText w:val=""/>
+      <w:lvlJc w:val="left"/>
+      <w:pPr>
+        <w:ind w:left="4320" w:hanging="360"/>
+      </w:pPr>
+      <w:rPr>
+        <w:rFonts w:ascii="Wingdings" w:hAnsi="Wingdings" w:hint="default"/>
+      </w:rPr>
+    </w:lvl>
+    <w:lvl w:ilvl="6" w:tplc="04090001" w:tentative="1">
+      <w:start w:val="1"/>
+      <w:numFmt w:val="bullet"/>
+      <w:lvlText w:val=""/>
+      <w:lvlJc w:val="left"/>
+      <w:pPr>
+        <w:ind w:left="5040" w:hanging="360"/>
+      </w:pPr>
+      <w:rPr>
+        <w:rFonts w:ascii="Symbol" w:hAnsi="Symbol" w:hint="default"/>
+      </w:rPr>
+    </w:lvl>
+    <w:lvl w:ilvl="7" w:tplc="04090003" w:tentative="1">
+      <w:start w:val="1"/>
+      <w:numFmt w:val="bullet"/>
+      <w:lvlText w:val="o"/>
+      <w:lvlJc w:val="left"/>
+      <w:pPr>
+        <w:ind w:left="5760" w:hanging="360"/>
+      </w:pPr>
+      <w:rPr>
+        <w:rFonts w:ascii="Courier New" w:hAnsi="Courier New" w:cs="Courier New" w:hint="default"/>
+      </w:rPr>
+    </w:lvl>
+    <w:lvl w:ilvl="8" w:tplc="04090005" w:tentative="1">
+      <w:start w:val="1"/>
+      <w:numFmt w:val="bullet"/>
+      <w:lvlText w:val=""/>
+      <w:lvlJc w:val="left"/>
+      <w:pPr>
+        <w:ind w:left="6480" w:hanging="360"/>
+      </w:pPr>
+      <w:rPr>
+        <w:rFonts w:ascii="Wingdings" w:hAnsi="Wingdings" w:hint="default"/>
+      </w:rPr>
+    </w:lvl>
+  </w:abstractNum>
+  <w:num w:numId="1" w16cid:durableId="1167860491">
+    <w:abstractNumId w:val="0"/>
+  </w:num>
+</w:numbering>
+</file>
+
 <file path=word/styles.xml><?xml version="1.0" encoding="utf-8"?>
-<w:styles xmlns:mc="http://schemas.openxmlformats.org/markup-compatibility/2006" xmlns:r="http://schemas.openxmlformats.org/officeDocument/2006/relationships" xmlns:w="http://schemas.openxmlformats.org/wordprocessingml/2006/main" xmlns:w14="http://schemas.microsoft.com/office/word/2010/wordml" xmlns:w15="http://schemas.microsoft.com/office/word/2012/wordml" xmlns:w16cex="http://schemas.microsoft.com/office/word/2018/wordml/cex" xmlns:w16cid="http://schemas.microsoft.com/office/word/2016/wordml/cid" xmlns:w16="http://schemas.microsoft.com/office/word/2018/wordml" xmlns:w16du="http://schemas.microsoft.com/office/word/2023/wordml/word16du" xmlns:w16sdtdh="http://schemas.microsoft.com/office/word/2020/wordml/sdtdatahash" xmlns:w16sdtfl="http://schemas.microsoft.com/office/word/2024/wordml/sdtformatlock" xmlns:w16se="http://schemas.microsoft.com/office/word/2015/wordml/symex" mc:Ignorable="w14 w15 w16se w16cid w16 w16cex w16sdtdh w16sdtfl w16du">
+<w:styles xmlns:mc="http://schemas.openxmlformats.org/markup-compatibility/2006" xmlns:r="http://schemas.openxmlformats.org/officeDocument/2006/relationships" xmlns:w="http://schemas.openxmlformats.org/wordprocessingml/2006/main" xmlns:w14="http://schemas.microsoft.com/office/word/2010/wordml" xmlns:w15="http://schemas.microsoft.com/office/word/2012/wordml" xmlns:w16cex="http://schemas.microsoft.com/office/word/2018/wordml/cex" xmlns:w16cid="http://schemas.microsoft.com/office/word/2016/wordml/cid" xmlns:w16="http://schemas.microsoft.com/office/word/2018/wordml" xmlns:w16sdtdh="http://schemas.microsoft.com/office/word/2020/wordml/sdtdatahash" xmlns:w16se="http://schemas.microsoft.com/office/word/2015/wordml/symex" mc:Ignorable="w14 w15 w16se w16cid w16 w16cex w16sdtdh">
   <w:docDefaults>
     <w:rPrDefault>
       <w:rPr>
@@ -1194,6 +3903,16 @@
       <w:spacing w:val="5"/>
     </w:rPr>
   </w:style>
+  <w:style w:type="character" w:styleId="PlaceholderText">
+    <w:name w:val="Placeholder Text"/>
+    <w:basedOn w:val="DefaultParagraphFont"/>
+    <w:uiPriority w:val="99"/>
+    <w:semiHidden/>
+    <w:rsid w:val="002B7228"/>
+    <w:rPr>
+      <w:color w:val="666666"/>
+    </w:rPr>
+  </w:style>
 </w:styles>
 </file>
 

</xml_diff>